<commit_message>
docs(grafana): update Vietnamese diacritics in Grafana TechLead Guide scripts and docx
Co-Authored-By: Claude Sonnet 4.6 <noreply@anthropic.com>
</commit_message>
<xml_diff>
--- a/docker/Grafana-TechLead-Guide.docx
+++ b/docker/Grafana-TechLead-Guide.docx
@@ -20,7 +20,7 @@
     </w:p>
     <w:p>
       <w:r>
-        <w:t>Phien ban: 1.0  |  Ngay: 04/06/2026  |  Stack: k6 + InfluxDB + Prometheus + Grafana + .NET 8</w:t>
+        <w:t>Phiên bản: 1.0  |  Ngày: 04/06/2026  |  Stack: k6 + InfluxDB + Prometheus + Grafana + .NET 8</w:t>
       </w:r>
     </w:p>
     <w:p/>
@@ -35,12 +35,12 @@
       </w:pPr>
       <w:r>
         <w:lastRenderedPageBreak/>
-        <w:t>CHUONG 1: HIEU BAN CHAT CAC DASHBOARD</w:t>
-      </w:r>
-    </w:p>
-    <w:p>
-      <w:r>
-        <w:t>Phan nay giai thich tung panel trong 2 dashboard dang chay, y nghia thuc te va nguong can chu y voi tu cach Technical Leader.</w:t>
+        <w:t>CHƯƠNG 1: HIỂU BẢN CHẤT CÁC DASHBOARD</w:t>
+      </w:r>
+    </w:p>
+    <w:p>
+      <w:r>
+        <w:t>Phần này giải thích từng panel trong 2 dashboard đang chạy, ý nghĩa thực tế và ngưỡng cần chú ý với tư cách Technical Leader.</w:t>
       </w:r>
     </w:p>
     <w:p>
@@ -53,7 +53,7 @@
     </w:p>
     <w:p>
       <w:r>
-        <w:t>Dashboard nay doc du lieu tu InfluxDB do k6 ghi vao real-time khi chay load test. Day la goc nhin tu phia CLIENT (k6 gia lap user).</w:t>
+        <w:t>Dashboard này đọc dữ liệu từ InfluxDB do k6 ghi vào real-time khi chạy load test. Đây là góc nhìn từ phía CLIENT (k6 giả lập user).</w:t>
       </w:r>
     </w:p>
     <w:p>
@@ -66,7 +66,7 @@
     </w:p>
     <w:p>
       <w:r>
-        <w:t>Checks trong k6 la cac assertion ban dinh nghia trong script, vi du: response status == 200, response time nho hon 500ms. Panel dem so check pass+fail moi giay.</w:t>
+        <w:t>Checks trong k6 là các assertion bạn định nghĩa trong script, ví dụ: response status == 200, response time nhỏ hơn 500ms. Panel đếm số check pass+fail mỗi giây.</w:t>
       </w:r>
     </w:p>
     <w:p>
@@ -74,7 +74,7 @@
         <w:pStyle w:val="ListBullet"/>
       </w:pPr>
       <w:r>
-        <w:t>Gia tri cao = nhieu request duoc xu ly va check dang pass</w:t>
+        <w:t>Giá trị cao = nhiều request được xử lý và check đang pass</w:t>
       </w:r>
     </w:p>
     <w:p>
@@ -82,7 +82,7 @@
         <w:pStyle w:val="ListBullet"/>
       </w:pPr>
       <w:r>
-        <w:t>Gia tri dot ngot giam = API bat dau fail checks hoac timeout</w:t>
+        <w:t>Giá trị đột ngột giảm = API bắt đầu fail checks hoặc timeout</w:t>
       </w:r>
     </w:p>
     <w:p>
@@ -90,7 +90,7 @@
         <w:pStyle w:val="ListBullet"/>
       </w:pPr>
       <w:r>
-        <w:t>Trong screenshot: tang tu 0 len ~400-500 checks/s theo so VU</w:t>
+        <w:t>Trong screenshot: tăng từ 0 lên ~400-500 checks/s theo số VU</w:t>
       </w:r>
     </w:p>
     <w:p>
@@ -99,7 +99,7 @@
           <w:b/>
           <w:color w:val="FF0000"/>
         </w:rPr>
-        <w:t>[CANH BAO] Neu Checks Per Second giam trong khi Virtual Users van tang = he thong bat dau nghen.</w:t>
+        <w:t>[CẢNH BÁO] Nếu Checks Per Second giảm trong khi Virtual Users vẫn tăng = hệ thống bắt đầu nghẽn.</w:t>
       </w:r>
     </w:p>
     <w:p>
@@ -112,7 +112,7 @@
     </w:p>
     <w:p>
       <w:r>
-        <w:t>P95 (Percentile 95) la thoi gian response ma 95% request hoan thanh duoi gia tri do. 5% request con lai cham hon. Day la metric quan trong nhat cho UX.</w:t>
+        <w:t>P95 (Percentile 95) là thời gian response mà 95% request hoàn thành dưới giá trị đó. 5% request còn lại chậm hơn. Đây là metric quan trọng nhất cho UX.</w:t>
       </w:r>
     </w:p>
     <w:p>
@@ -120,7 +120,7 @@
         <w:pStyle w:val="ListBullet"/>
       </w:pPr>
       <w:r>
-        <w:t>P95 duoi 500ms: Tot cho web API</w:t>
+        <w:t>P95 dưới 500ms: Tốt cho web API</w:t>
       </w:r>
     </w:p>
     <w:p>
@@ -128,7 +128,7 @@
         <w:pStyle w:val="ListBullet"/>
       </w:pPr>
       <w:r>
-        <w:t>P95 tu 500ms den 2s: Chap nhan duoc, can theo doi</w:t>
+        <w:t>P95 từ 500ms đến 2s: Chấp nhận được, cần theo dõi</w:t>
       </w:r>
     </w:p>
     <w:p>
@@ -136,7 +136,7 @@
         <w:pStyle w:val="ListBullet"/>
       </w:pPr>
       <w:r>
-        <w:t>P95 tu 2s den 5s: Xau, users nhan thay cham ro ret</w:t>
+        <w:t>P95 từ 2s đến 5s: Xấu, users nhận thấy chậm rõ rệt</w:t>
       </w:r>
     </w:p>
     <w:p>
@@ -144,7 +144,7 @@
         <w:pStyle w:val="ListBullet"/>
       </w:pPr>
       <w:r>
-        <w:t>P95 tren 5s: Nghiem trong, can action ngay</w:t>
+        <w:t>P95 trên 5s: Nghiêm trọng, cần action ngay</w:t>
       </w:r>
     </w:p>
     <w:p>
@@ -153,7 +153,7 @@
           <w:b/>
           <w:color w:val="FF0000"/>
         </w:rPr>
-        <w:t>[CANH BAO] SCREENSHOT: P95 tang len 30s - he thong dang collapse duoi tai cao (600 VU). Day la nguong CUC KY NGHIEM TRONG trong production.</w:t>
+        <w:t>[CẢNH BÁO] SCREENSHOT: P95 tăng lên 30s - hệ thống đang collapse dưới tải cao (600 VU). Đây là ngưỡng CỰC KỲ NGHIÊM TRỌNG trong production.</w:t>
       </w:r>
     </w:p>
     <w:p>
@@ -166,7 +166,7 @@
     </w:p>
     <w:p>
       <w:r>
-        <w:t>Ti le phan tram request bi loi (HTTP 4xx/5xx hoac timeout). Tinh tu metric http_req_failed trong InfluxDB.</w:t>
+        <w:t>Tỉ lệ phần trăm request bị lỗi (HTTP 4xx/5xx hoặc timeout). Tính từ metric http_req_failed trong InfluxDB.</w:t>
       </w:r>
     </w:p>
     <w:p>
@@ -174,7 +174,7 @@
         <w:pStyle w:val="ListBullet"/>
       </w:pPr>
       <w:r>
-        <w:t>Error Rate = 0%: Tot</w:t>
+        <w:t>Error Rate = 0%: Tốt</w:t>
       </w:r>
     </w:p>
     <w:p>
@@ -182,7 +182,7 @@
         <w:pStyle w:val="ListBullet"/>
       </w:pPr>
       <w:r>
-        <w:t>Error Rate duoi 0.1%: Chap nhan duoc cho hau het he thong</w:t>
+        <w:t>Error Rate dưới 0.1%: Chấp nhận được cho hầu hết hệ thống</w:t>
       </w:r>
     </w:p>
     <w:p>
@@ -190,7 +190,7 @@
         <w:pStyle w:val="ListBullet"/>
       </w:pPr>
       <w:r>
-        <w:t>Error Rate tren 1%: Can dieu tra</w:t>
+        <w:t>Error Rate trên 1%: Cần điều tra</w:t>
       </w:r>
     </w:p>
     <w:p>
@@ -198,7 +198,7 @@
         <w:pStyle w:val="ListBullet"/>
       </w:pPr>
       <w:r>
-        <w:t>Error Rate tren 5%: Alert ngay lap tuc</w:t>
+        <w:t>Error Rate trên 5%: Alert ngay lập tức</w:t>
       </w:r>
     </w:p>
     <w:p>
@@ -207,7 +207,7 @@
           <w:b/>
           <w:color w:val="008000"/>
         </w:rPr>
-        <w:t>[OK] Trong screenshot: Error Rate = 0% - API khong tra loi. Nhung response time rat cao cho thay timeout phia client se xay ra neu test tiep tuc.</w:t>
+        <w:t>[OK] Trong screenshot: Error Rate = 0% - API không trả lỗi. Nhưng response time rất cao cho thấy timeout phía client sẽ xảy ra nếu test tiếp tục.</w:t>
       </w:r>
     </w:p>
     <w:p>
@@ -220,7 +220,7 @@
     </w:p>
     <w:p>
       <w:r>
-        <w:t>Throughput thuc te - so request duoc gui va nhan moi giay. Day la thuoc do nang luc cua he thong.</w:t>
+        <w:t>Throughput thực tế - số request được gửi và nhận mỗi giây. Đây là thước đo năng lực của hệ thống.</w:t>
       </w:r>
     </w:p>
     <w:p>
@@ -228,7 +228,7 @@
         <w:pStyle w:val="ListBullet"/>
       </w:pPr>
       <w:r>
-        <w:t>RPS tang tuyen tinh voi VU = he thong dang scale tot</w:t>
+        <w:t>RPS tăng tuyến tính với VU = hệ thống đang scale tốt</w:t>
       </w:r>
     </w:p>
     <w:p>
@@ -236,7 +236,7 @@
         <w:pStyle w:val="ListBullet"/>
       </w:pPr>
       <w:r>
-        <w:t>RPS plateau trong khi VU van tang = he thong da dat gioi han (bottleneck)</w:t>
+        <w:t>RPS plateau trong khi VU vẫn tăng = hệ thống đã đạt giới hạn (bottleneck)</w:t>
       </w:r>
     </w:p>
     <w:p>
@@ -244,7 +244,7 @@
         <w:pStyle w:val="ListBullet"/>
       </w:pPr>
       <w:r>
-        <w:t>RPS giam trong khi VU tang = he thong dang reject requests hoac timeout</w:t>
+        <w:t>RPS giảm trong khi VU tăng = hệ thống đang reject requests hoặc timeout</w:t>
       </w:r>
     </w:p>
     <w:p>
@@ -253,7 +253,7 @@
       </w:pPr>
       <w:r>
         <w:lastRenderedPageBreak/>
-        <w:t>Trong screenshot: RPS ~200-300, co spike - khong on dinh</w:t>
+        <w:t>Trong screenshot: RPS ~200-300, có spike - không ổn định</w:t>
       </w:r>
     </w:p>
     <w:p>
@@ -266,7 +266,7 @@
     </w:p>
     <w:p>
       <w:r>
-        <w:t>So luong user ao dang dong thoi gui request. k6 ramp VU theo cau hinh script. Panel cho biet muc do tai ban dang tao ra.</w:t>
+        <w:t>Số lượng user ảo đang đồng thời gửi request. k6 ramp VU theo cấu hình script. Panel cho biết mức độ tải bạn đang tạo ra.</w:t>
       </w:r>
     </w:p>
     <w:p>
@@ -274,7 +274,7 @@
         <w:pStyle w:val="ListBullet"/>
       </w:pPr>
       <w:r>
-        <w:t>Trong screenshot: VU tang tu 0 len ~600 trong ~10 phut - day la stress test</w:t>
+        <w:t>Trong screenshot: VU tăng từ 0 lên ~600 trong ~10 phút - đây là stress test</w:t>
       </w:r>
     </w:p>
     <w:p>
@@ -282,7 +282,7 @@
         <w:pStyle w:val="ListBullet"/>
       </w:pPr>
       <w:r>
-        <w:t>VU 600 voi response time 30s cho thay system breaking point o ~200-300 VU</w:t>
+        <w:t>VU 600 với response time 30s cho thấy system breaking point ở ~200-300 VU</w:t>
       </w:r>
     </w:p>
     <w:p>
@@ -295,7 +295,7 @@
     </w:p>
     <w:p>
       <w:r>
-        <w:t>Mean response time cua tat ca request. It dai dien hon P95 vi bi anh huong boi outlier.</w:t>
+        <w:t>Mean response time của tất cả request. Ít đại diện hơn P95 vì bị ảnh hưởng bởi outlier.</w:t>
       </w:r>
     </w:p>
     <w:p>
@@ -303,7 +303,7 @@
         <w:pStyle w:val="ListBullet"/>
       </w:pPr>
       <w:r>
-        <w:t>Trong screenshot: Average ~20s - cung thoi diem P95 = 30s, he thong toan dien cham</w:t>
+        <w:t>Trong screenshot: Average ~20s - cùng thời điểm P95 = 30s, hệ thống toàn diện chậm</w:t>
       </w:r>
     </w:p>
     <w:p>
@@ -322,7 +322,7 @@
     </w:p>
     <w:p>
       <w:r>
-        <w:t>Dashboard nay doc tu Prometheus scrape /metrics cua .NET API. Day la goc nhin tu phia SERVER.</w:t>
+        <w:t>Dashboard này đọc từ Prometheus scrape /metrics của .NET API. Đây là góc nhìn từ phía SERVER.</w:t>
       </w:r>
     </w:p>
     <w:p>
@@ -335,7 +335,7 @@
     </w:p>
     <w:p>
       <w:r>
-        <w:t>Prometheus health check. UP=1 nghia la Prometheus scrape duoc /metrics tu API. DOWN=0 nghia la API khong reachable.</w:t>
+        <w:t>Prometheus health check. UP=1 nghĩa là Prometheus scrape được /metrics từ API. DOWN=0 nghĩa là API không reachable.</w:t>
       </w:r>
     </w:p>
     <w:p>
@@ -344,7 +344,7 @@
           <w:b/>
           <w:color w:val="008000"/>
         </w:rPr>
-        <w:t>[OK] Trong screenshot: = 1 (UP) - API dang song va expose metrics.</w:t>
+        <w:t>[OK] Trong screenshot: = 1 (UP) - API đang sống và expose metrics.</w:t>
       </w:r>
     </w:p>
     <w:p>
@@ -353,7 +353,7 @@
           <w:b/>
           <w:color w:val="FF0000"/>
         </w:rPr>
-        <w:t>[CANH BAO] Luu y: UP chi nghia la /metrics accessible, KHONG phai API dang xu ly dung.</w:t>
+        <w:t>[CẢNH BÁO] Lưu ý: UP chỉ nghĩa là /metrics accessible, KHÔNG phải API đang xử lý đúng.</w:t>
       </w:r>
     </w:p>
     <w:p>
@@ -366,7 +366,7 @@
     </w:p>
     <w:p>
       <w:r>
-        <w:t>So request/giay tinh tu phia server (metric http_requests_received_total). So sanh voi RPS cua k6:</w:t>
+        <w:t>Số request/giây tính từ phía server (metric http_requests_received_total). So sánh với RPS của k6:</w:t>
       </w:r>
     </w:p>
     <w:p>
@@ -374,7 +374,7 @@
         <w:pStyle w:val="ListBullet"/>
       </w:pPr>
       <w:r>
-        <w:t>Neu k6 RPS lon hon API Request Rate = requests bi drop truoc khi vao API</w:t>
+        <w:t>Nếu k6 RPS lớn hơn API Request Rate = requests bị drop trước khi vào API</w:t>
       </w:r>
     </w:p>
     <w:p>
@@ -382,7 +382,7 @@
         <w:pStyle w:val="ListBullet"/>
       </w:pPr>
       <w:r>
-        <w:t>Neu k6 RPS bang API Request Rate = requests den duoc API, van de la xu ly ben trong</w:t>
+        <w:t>Nếu k6 RPS bằng API Request Rate = requests đến được API, vấn đề là xử lý bên trong</w:t>
       </w:r>
     </w:p>
     <w:p>
@@ -390,7 +390,7 @@
         <w:pStyle w:val="ListBullet"/>
       </w:pPr>
       <w:r>
-        <w:t>Trong screenshot: API Request Rate ~60-80/s, k6 ghi ~200-300/s - chenh lech do buffering/queueing</w:t>
+        <w:t>Trong screenshot: API Request Rate ~60-80/s, k6 ghi ~200-300/s - chênh lệch do buffering/queueing</w:t>
       </w:r>
     </w:p>
     <w:p>
@@ -403,7 +403,7 @@
     </w:p>
     <w:p>
       <w:r>
-        <w:t>.NET Thread Pool thread count. So thread tang khi co nhieu I/O blocking (database, HTTP calls).</w:t>
+        <w:t>.NET Thread Pool thread count. Số thread tăng khi có nhiều I/O blocking (database, HTTP calls).</w:t>
       </w:r>
     </w:p>
     <w:p>
@@ -411,7 +411,7 @@
         <w:pStyle w:val="ListBullet"/>
       </w:pPr>
       <w:r>
-        <w:t>Thread count tang = nhieu request dang bi block cho I/O (thuong la database)</w:t>
+        <w:t>Thread count tăng = nhiều request đang bị block chờ I/O (thường là database)</w:t>
       </w:r>
     </w:p>
     <w:p>
@@ -419,7 +419,7 @@
         <w:pStyle w:val="ListBullet"/>
       </w:pPr>
       <w:r>
-        <w:t>Thread count plateau roi khong tang them = ThreadPool exhausted, request queue up</w:t>
+        <w:t>Thread count plateau rồi không tăng thêm = ThreadPool exhausted, request queue up</w:t>
       </w:r>
     </w:p>
     <w:p>
@@ -428,7 +428,7 @@
           <w:b/>
           <w:color w:val="FF0000"/>
         </w:rPr>
-        <w:t>[CANH BAO] SCREENSHOT: Thread tang tu ~20 len ~100+ va van dang tang - day la dau hieu thread pool pressure. Nguyen nhan: database query cham hoac sync blocking code.</w:t>
+        <w:t>[CẢNH BÁO] SCREENSHOT: Thread tăng từ ~20 lên ~100+ và vẫn đang tăng - đây là dấu hiệu thread pool pressure. Nguyên nhân: database query chậm hoặc sync blocking code.</w:t>
       </w:r>
     </w:p>
     <w:p>
@@ -441,7 +441,7 @@
     </w:p>
     <w:p>
       <w:r>
-        <w:t>P95 latency do tu phia server (Prometheus histogram). So sanh voi P95 cua k6:</w:t>
+        <w:t>P95 latency đo từ phía server (Prometheus histogram). So sánh với P95 của k6:</w:t>
       </w:r>
     </w:p>
     <w:p>
@@ -449,7 +449,7 @@
         <w:pStyle w:val="ListBullet"/>
       </w:pPr>
       <w:r>
-        <w:t>Neu server P95 nho hon k6 P95 = co overhead o network/client side</w:t>
+        <w:t>Nếu server P95 nhỏ hơn k6 P95 = có overhead ở network/client side</w:t>
       </w:r>
     </w:p>
     <w:p>
@@ -457,7 +457,7 @@
         <w:pStyle w:val="ListBullet"/>
       </w:pPr>
       <w:r>
-        <w:t>Neu server P95 bang k6 P95 = van de nam trong API processing</w:t>
+        <w:t>Nếu server P95 bằng k6 P95 = vấn đề nằm trong API processing</w:t>
       </w:r>
     </w:p>
     <w:p>
@@ -465,7 +465,7 @@
         <w:pStyle w:val="ListBullet"/>
       </w:pPr>
       <w:r>
-        <w:t>Trong screenshot tooltip: 198ms luc 11:47:55 (tot), tang len ~25s sau (he thong nghen)</w:t>
+        <w:t>Trong screenshot tooltip: 198ms lúc 11:47:55 (tốt), tăng lên ~25s sau (hệ thống nghẽn)</w:t>
       </w:r>
     </w:p>
     <w:p>
@@ -479,7 +479,7 @@
       </w:pPr>
       <w:r>
         <w:lastRenderedPageBreak/>
-        <w:t>CHUONG 2: DOC DASHBOARD VOI CON MAT TECHNICAL LEADER</w:t>
+        <w:t>CHƯƠNG 2: ĐỌC DASHBOARD VỚI CON MẮT TECHNICAL LEADER</w:t>
       </w:r>
     </w:p>
     <w:p>
@@ -487,7 +487,7 @@
         <w:pStyle w:val="Heading2"/>
       </w:pPr>
       <w:r>
-        <w:t>2.1 Chan Doan Screenshot Hien Tai</w:t>
+        <w:t>2.1 Chẩn Đoán Screenshot Hiện Tại</w:t>
       </w:r>
     </w:p>
     <w:p>
@@ -496,12 +496,12 @@
           <w:b/>
           <w:color w:val="FF0000"/>
         </w:rPr>
-        <w:t>[CANH BAO] CHAN DOAN: He thong dang bi THREAD POOL EXHAUSTION + DATABASE BOTTLENECK</w:t>
-      </w:r>
-    </w:p>
-    <w:p>
-      <w:r>
-        <w:t>Chuoi su kien tu 2 screenshot (11:45 - 11:55):</w:t>
+        <w:t>[CẢNH BÁO] CHẨN ĐOÁN: Hệ thống đang bị THREAD POOL EXHAUSTION + DATABASE BOTTLENECK</w:t>
+      </w:r>
+    </w:p>
+    <w:p>
+      <w:r>
+        <w:t>Chuỗi sự kiện từ 2 screenshot (11:45 - 11:55):</w:t>
       </w:r>
     </w:p>
     <w:p>
@@ -509,7 +509,7 @@
         <w:pStyle w:val="ListBullet"/>
       </w:pPr>
       <w:r>
-        <w:t>11:40-11:47: VU tang 0 -&gt; 300, P95 tot (~200ms), Thread = 20-40</w:t>
+        <w:t>11:40-11:47: VU tăng 0 -&gt; 300, P95 tốt (~200ms), Thread = 20-40</w:t>
       </w:r>
     </w:p>
     <w:p>
@@ -517,7 +517,7 @@
         <w:pStyle w:val="ListBullet"/>
       </w:pPr>
       <w:r>
-        <w:t>11:47-11:50: VU vuot 300, Thread tang nhanh 40 -&gt; 80, P95 tang 5-10s</w:t>
+        <w:t>11:47-11:50: VU vượt 300, Thread tăng nhanh 40 -&gt; 80, P95 tăng 5-10s</w:t>
       </w:r>
     </w:p>
     <w:p>
@@ -525,7 +525,7 @@
         <w:pStyle w:val="ListBullet"/>
       </w:pPr>
       <w:r>
-        <w:t>11:50-11:55: VU dat 500-600, Thread ~100+, P95 = 20-30s, Average = 15-20s</w:t>
+        <w:t>11:50-11:55: VU đạt 500-600, Thread ~100+, P95 = 20-30s, Average = 15-20s</w:t>
       </w:r>
     </w:p>
     <w:p>
@@ -533,12 +533,12 @@
         <w:pStyle w:val="ListBullet"/>
       </w:pPr>
       <w:r>
-        <w:t>Error Rate van 0% - API khong crash, chi cuc ky cham</w:t>
-      </w:r>
-    </w:p>
-    <w:p>
-      <w:r>
-        <w:t>Giai thich ky thuat:</w:t>
+        <w:t>Error Rate vẫn 0% - API không crash, chỉ cực kỳ chậm</w:t>
+      </w:r>
+    </w:p>
+    <w:p>
+      <w:r>
+        <w:t>Giải thích kỹ thuật:</w:t>
       </w:r>
     </w:p>
     <w:p>
@@ -546,7 +546,7 @@
         <w:pStyle w:val="ListBullet"/>
       </w:pPr>
       <w:r>
-        <w:t>Database (SQL Server) la bottleneck: moi request can query DB, khi 600 VU cung query thi DB queue day</w:t>
+        <w:t>Database (SQL Server) là bottleneck: mỗi request cần query DB, khi 600 VU cùng query thì DB queue đầy</w:t>
       </w:r>
     </w:p>
     <w:p>
@@ -554,7 +554,7 @@
         <w:pStyle w:val="ListBullet"/>
       </w:pPr>
       <w:r>
-        <w:t>.NET ThreadPool cap them thread cho cho DB (I/O-bound), nhung thread co gioi han</w:t>
+        <w:t>.NET ThreadPool cấp thêm thread để chờ DB (I/O-bound), nhưng thread có giới hạn</w:t>
       </w:r>
     </w:p>
     <w:p>
@@ -562,7 +562,7 @@
         <w:pStyle w:val="ListBullet"/>
       </w:pPr>
       <w:r>
-        <w:t>Thread pool pressure lam request moi phai cho thread tu do -&gt; P95 tang vot</w:t>
+        <w:t>Thread pool pressure làm request mới phải chờ thread tự do -&gt; P95 tăng vọt</w:t>
       </w:r>
     </w:p>
     <w:p>
@@ -570,7 +570,7 @@
         <w:pStyle w:val="ListBullet"/>
       </w:pPr>
       <w:r>
-        <w:t>Day la pattern CLASSIC cua N+1 query hoac thieu DB connection pooling</w:t>
+        <w:t>Đây là pattern CLASSIC của N+1 query hoặc thiếu DB connection pooling</w:t>
       </w:r>
     </w:p>
     <w:p>
@@ -578,7 +578,7 @@
         <w:pStyle w:val="Heading2"/>
       </w:pPr>
       <w:r>
-        <w:t>2.2 Nguong Technical Leader Can Quan Tam</w:t>
+        <w:t>2.2 Ngưỡng Technical Leader Cần Quan Tâm</w:t>
       </w:r>
     </w:p>
     <w:p>
@@ -587,7 +587,7 @@
           <w:b/>
           <w:i/>
         </w:rPr>
-        <w:t>Bang 1: Nguong quyet dinh cho Technical Leader</w:t>
+        <w:t>Bảng 1: Ngưỡng quyết định cho Technical Leader</w:t>
       </w:r>
     </w:p>
     <w:tbl>
@@ -639,7 +639,7 @@
               <w:rPr>
                 <w:b/>
               </w:rPr>
-              <w:t>Tot (Green)</w:t>
+              <w:t>Tốt (Green)</w:t>
             </w:r>
           </w:p>
         </w:tc>
@@ -658,7 +658,7 @@
               <w:rPr>
                 <w:b/>
               </w:rPr>
-              <w:t>Canh bao (Yellow)</w:t>
+              <w:t>Cảnh báo (Yellow)</w:t>
             </w:r>
           </w:p>
         </w:tc>
@@ -677,7 +677,7 @@
               <w:rPr>
                 <w:b/>
               </w:rPr>
-              <w:t>Nguy hiem (Red)</w:t>
+              <w:t>Nguy hiểm (Red)</w:t>
             </w:r>
           </w:p>
         </w:tc>
@@ -720,7 +720,7 @@
           </w:tcPr>
           <w:p>
             <w:r>
-              <w:t>duoi 500ms</w:t>
+              <w:t>dưới 500ms</w:t>
             </w:r>
           </w:p>
         </w:tc>
@@ -742,7 +742,7 @@
           </w:tcPr>
           <w:p>
             <w:r>
-              <w:t>tren 2s</w:t>
+              <w:t>trên 2s</w:t>
             </w:r>
           </w:p>
         </w:tc>
@@ -777,7 +777,7 @@
           </w:tcPr>
           <w:p>
             <w:r>
-              <w:t>duoi 0.1%</w:t>
+              <w:t>dưới 0.1%</w:t>
             </w:r>
           </w:p>
         </w:tc>
@@ -799,7 +799,7 @@
           </w:tcPr>
           <w:p>
             <w:r>
-              <w:t>tren 1%</w:t>
+              <w:t>trên 1%</w:t>
             </w:r>
           </w:p>
         </w:tc>
@@ -834,7 +834,7 @@
           </w:tcPr>
           <w:p>
             <w:r>
-              <w:t>duoi 50</w:t>
+              <w:t>dưới 50</w:t>
             </w:r>
           </w:p>
         </w:tc>
@@ -856,7 +856,7 @@
           </w:tcPr>
           <w:p>
             <w:r>
-              <w:t>tren 150 tang lien tuc</w:t>
+              <w:t>trên 150 tăng liên tục</w:t>
             </w:r>
           </w:p>
         </w:tc>
@@ -948,7 +948,7 @@
           </w:tcPr>
           <w:p>
             <w:r>
-              <w:t>Tang theo VU</w:t>
+              <w:t>Tăng theo VU</w:t>
             </w:r>
           </w:p>
         </w:tc>
@@ -959,7 +959,7 @@
           </w:tcPr>
           <w:p>
             <w:r>
-              <w:t>Plateau khi VU tang</w:t>
+              <w:t>Plateau khi VU tăng</w:t>
             </w:r>
           </w:p>
         </w:tc>
@@ -970,7 +970,7 @@
           </w:tcPr>
           <w:p>
             <w:r>
-              <w:t>Giam khi VU tang</w:t>
+              <w:t>Giảm khi VU tăng</w:t>
             </w:r>
           </w:p>
         </w:tc>
@@ -996,7 +996,7 @@
       </w:r>
       <w:r>
         <w:lastRenderedPageBreak/>
-        <w:t>CHUONG 3: NGOAI DASHBOARD - CAC THUC HANH QUAN TRONG HON</w:t>
+        <w:t>CHƯƠNG 3: NGOÀI DASHBOARD - CÁC THỰC HÀNH QUAN TRỌNG HƠN</w:t>
       </w:r>
     </w:p>
     <w:p>
@@ -1004,12 +1004,12 @@
         <w:pStyle w:val="Heading2"/>
       </w:pPr>
       <w:r>
-        <w:t>3.1 Alerting - Tu Dong Phat Hien Van De</w:t>
-      </w:r>
-    </w:p>
-    <w:p>
-      <w:r>
-        <w:t>Grafana Alert rules tu dong notify khi metric vuot nguong. KHONG nen ngoi nhin dashboard thu cong. Day la yeu cau bat buoc trong production.</w:t>
+        <w:t>3.1 Alerting - Tự Động Phát Hiện Vấn Đề</w:t>
+      </w:r>
+    </w:p>
+    <w:p>
+      <w:r>
+        <w:t>Grafana Alert rules tự động notify khi metric vượt ngưỡng. KHÔNG nên ngồi nhìn dashboard thủ công. Đây là yêu cầu bắt buộc trong production.</w:t>
       </w:r>
     </w:p>
     <w:p>
@@ -1018,7 +1018,7 @@
           <w:b/>
           <w:i/>
         </w:rPr>
-        <w:t>Bang 2: Alert rules can thiet lap ngay trong Grafana Alerting</w:t>
+        <w:t>Bảng 2: Alert rules cần thiết lập ngay trong Grafana Alerting</w:t>
       </w:r>
     </w:p>
     <w:tbl>
@@ -1088,7 +1088,7 @@
               <w:rPr>
                 <w:b/>
               </w:rPr>
-              <w:t>Nguong</w:t>
+              <w:t>Ngưỡng</w:t>
             </w:r>
           </w:p>
         </w:tc>
@@ -1353,7 +1353,7 @@
       </w:r>
       <w:r>
         <w:lastRenderedPageBreak/>
-        <w:t>CHUONG 4: USE CASE THUC TE - CHAN DOAN VA XU LY</w:t>
+        <w:t>CHƯƠNG 4: USE CASE THỰC TẾ - CHẨN ĐOÁN VÀ XỬ LÝ</w:t>
       </w:r>
     </w:p>
     <w:p>
@@ -1361,12 +1361,12 @@
         <w:pStyle w:val="Heading2"/>
       </w:pPr>
       <w:r>
-        <w:t>4.1 Use Case: API Cham Dan Sau 30 Phut Chay</w:t>
-      </w:r>
-    </w:p>
-    <w:p>
-      <w:r>
-        <w:t>Tinh huong: Dashboard binh thuong luc deploy, nhung sau 30 phut P95 tang tu 200ms len 2s ma khong co them traffic.</w:t>
+        <w:t>4.1 Use Case: API Chậm Dần Sau 30 Phút Chạy</w:t>
+      </w:r>
+    </w:p>
+    <w:p>
+      <w:r>
+        <w:t>Tình huống: Dashboard bình thường lúc deploy, nhưng sau 30 phút P95 tăng từ 200ms lên 2s mà không có thêm traffic.</w:t>
       </w:r>
     </w:p>
     <w:p>
@@ -1374,7 +1374,7 @@
         <w:pStyle w:val="Heading3"/>
       </w:pPr>
       <w:r>
-        <w:t>Buoc 1 - Nhin dashboard, dat cau hoi:</w:t>
+        <w:t>Bước 1 - Nhìn dashboard, đặt câu hỏi:</w:t>
       </w:r>
     </w:p>
     <w:p>
@@ -1382,7 +1382,7 @@
         <w:pStyle w:val="ListBullet"/>
       </w:pPr>
       <w:r>
-        <w:t>Memory co tang khong? -&gt; process_resident_memory_bytes</w:t>
+        <w:t>Memory có tăng không? -&gt; process_resident_memory_bytes</w:t>
       </w:r>
     </w:p>
     <w:p>
@@ -1390,7 +1390,7 @@
         <w:pStyle w:val="ListBullet"/>
       </w:pPr>
       <w:r>
-        <w:t>Thread co tang khong? -&gt; process_num_threads</w:t>
+        <w:t>Thread có tăng không? -&gt; process_num_threads</w:t>
       </w:r>
     </w:p>
     <w:p>
@@ -1398,7 +1398,7 @@
         <w:pStyle w:val="ListBullet"/>
       </w:pPr>
       <w:r>
-        <w:t>Error rate co thay doi khong?</w:t>
+        <w:t>Error rate có thay đổi không?</w:t>
       </w:r>
     </w:p>
     <w:p>
@@ -1406,7 +1406,7 @@
         <w:pStyle w:val="ListBullet"/>
       </w:pPr>
       <w:r>
-        <w:t>GC co chay nhieu khong? -&gt; dotnet_gc_collections_total</w:t>
+        <w:t>GC có chạy nhiều không? -&gt; dotnet_gc_collections_total</w:t>
       </w:r>
     </w:p>
     <w:p>
@@ -1414,7 +1414,7 @@
         <w:pStyle w:val="Heading3"/>
       </w:pPr>
       <w:r>
-        <w:t>Buoc 2 - Kiem tra memory leak:</w:t>
+        <w:t>Bước 2 - Kiểm tra memory leak:</w:t>
       </w:r>
     </w:p>
     <w:p>
@@ -1444,7 +1444,7 @@
           <w:color w:val="000080"/>
           <w:sz w:val="18"/>
         </w:rPr>
-        <w:t># Neu line di len lien tuc khong xuong = memory leak</w:t>
+        <w:t># Nếu line đi lên liên tục không xuống = memory leak</w:t>
       </w:r>
     </w:p>
     <w:p>
@@ -1452,7 +1452,7 @@
         <w:pStyle w:val="Heading3"/>
       </w:pPr>
       <w:r>
-        <w:t>Buoc 3 - Xem GC hoat dong:</w:t>
+        <w:t>Bước 3 - Xem GC hoạt động:</w:t>
       </w:r>
     </w:p>
     <w:p>
@@ -1482,7 +1482,7 @@
           <w:color w:val="000080"/>
           <w:sz w:val="18"/>
         </w:rPr>
-        <w:t># GC Gen2 rate cao nhung memory van tang = GC khong collect duoc = leak</w:t>
+        <w:t># GC Gen2 rate cao nhưng memory vẫn tăng = GC không collect được = leak</w:t>
       </w:r>
     </w:p>
     <w:p>
@@ -1490,7 +1490,7 @@
         <w:pStyle w:val="Heading3"/>
       </w:pPr>
       <w:r>
-        <w:t>Nguyen nhan va Fix:</w:t>
+        <w:t>Nguyên nhân và Fix:</w:t>
       </w:r>
     </w:p>
     <w:p>
@@ -1498,7 +1498,7 @@
         <w:pStyle w:val="ListBullet"/>
       </w:pPr>
       <w:r>
-        <w:t>Static collection khong duoc clear: List(T) static tich luy data qua tung request</w:t>
+        <w:t>Static collection không được clear: List(T) static tích lũy data qua từng request</w:t>
       </w:r>
     </w:p>
     <w:p>
@@ -1506,7 +1506,7 @@
         <w:pStyle w:val="ListBullet"/>
       </w:pPr>
       <w:r>
-        <w:t>HttpClient khong duoc dispose: dung IHttpClientFactory thay vi new HttpClient()</w:t>
+        <w:t>HttpClient không được dispose: dùng IHttpClientFactory thay vì new HttpClient()</w:t>
       </w:r>
     </w:p>
     <w:p>
@@ -1514,7 +1514,7 @@
         <w:pStyle w:val="ListBullet"/>
       </w:pPr>
       <w:r>
-        <w:t>Event handler subscription khong unsubscribe: memory leak classic trong .NET</w:t>
+        <w:t>Event handler subscription không unsubscribe: memory leak classic trong .NET</w:t>
       </w:r>
     </w:p>
     <w:p>
@@ -1522,7 +1522,7 @@
         <w:pStyle w:val="ListBullet"/>
       </w:pPr>
       <w:r>
-        <w:t>Tool dieu tra: dotnet-dump, dotnet-gcdump de snapshot heap</w:t>
+        <w:t>Tool điều tra: dotnet-dump, dotnet-gcdump để snapshot heap</w:t>
       </w:r>
     </w:p>
     <w:p>
@@ -1530,12 +1530,12 @@
         <w:pStyle w:val="Heading2"/>
       </w:pPr>
       <w:r>
-        <w:t>4.2 Use Case: Error Rate Dot Ngot Tang Len 5%</w:t>
-      </w:r>
-    </w:p>
-    <w:p>
-      <w:r>
-        <w:t>Tinh huong: Alert do xuong, Error Rate tu 0% len 5%, P95 tang vot.</w:t>
+        <w:t>4.2 Use Case: Error Rate Đột Ngột Tăng Lên 5%</w:t>
+      </w:r>
+    </w:p>
+    <w:p>
+      <w:r>
+        <w:t>Tình huống: Alert đổ xuống, Error Rate từ 0% lên 5%, P95 tăng vọt.</w:t>
       </w:r>
     </w:p>
     <w:p>
@@ -1543,7 +1543,7 @@
         <w:pStyle w:val="Heading3"/>
       </w:pPr>
       <w:r>
-        <w:t>Xac dinh loai loi:</w:t>
+        <w:t>Xác định loại lỗi:</w:t>
       </w:r>
     </w:p>
     <w:p>
@@ -1612,7 +1612,7 @@
         <w:pStyle w:val="ListBullet"/>
       </w:pPr>
       <w:r>
-        <w:t>Neu DB down: failover sang replica, enable read-only mode</w:t>
+        <w:t>Nếu DB down: failover sang replica, enable read-only mode</w:t>
       </w:r>
     </w:p>
     <w:p>
@@ -1620,7 +1620,7 @@
         <w:pStyle w:val="ListBullet"/>
       </w:pPr>
       <w:r>
-        <w:t>Neu OOM Kill: docker restart api (sau do dieu tra goc rech)</w:t>
+        <w:t>Nếu OOM Kill: docker restart api (sau đó điều tra gốc rễ)</w:t>
       </w:r>
     </w:p>
     <w:p>
@@ -1628,7 +1628,7 @@
         <w:pStyle w:val="ListBullet"/>
       </w:pPr>
       <w:r>
-        <w:t>Neu deployment bad: rollback sang version truoc</w:t>
+        <w:t>Nếu deployment bad: rollback sang version trước</w:t>
       </w:r>
     </w:p>
     <w:p>
@@ -1636,7 +1636,7 @@
         <w:pStyle w:val="ListBullet"/>
       </w:pPr>
       <w:r>
-        <w:t>Neu external service down: circuit breaker activate, return cached response</w:t>
+        <w:t>Nếu external service down: circuit breaker activate, return cached response</w:t>
       </w:r>
     </w:p>
     <w:p>
@@ -1644,12 +1644,12 @@
         <w:pStyle w:val="Heading2"/>
       </w:pPr>
       <w:r>
-        <w:t>4.3 Use Case: Thread Count Tang Vot (Nhu Screenshot Cua Ban)</w:t>
-      </w:r>
-    </w:p>
-    <w:p>
-      <w:r>
-        <w:t>Tinh huong: Thread tang tu 20 len 100+ theo VU, P95 tang vot.</w:t>
+        <w:t>4.3 Use Case: Thread Count Tăng Vọt (Như Screenshot Của Bạn)</w:t>
+      </w:r>
+    </w:p>
+    <w:p>
+      <w:r>
+        <w:t>Tình huống: Thread tăng từ 20 lên 100+ theo VU, P95 tăng vọt.</w:t>
       </w:r>
     </w:p>
     <w:p>
@@ -1665,7 +1665,7 @@
         <w:pStyle w:val="ListBullet"/>
       </w:pPr>
       <w:r>
-        <w:t>Voi .NET async/await dung: thread khong nen tang nhieu du nhieu concurrent request</w:t>
+        <w:t>Với .NET async/await đúng: thread không nên tăng nhiều dù nhiều concurrent request</w:t>
       </w:r>
     </w:p>
     <w:p>
@@ -1674,7 +1674,7 @@
       </w:pPr>
       <w:r>
         <w:lastRenderedPageBreak/>
-        <w:t>Thread tang = code dang block thread (sync wait, Task.Result, .Wait(), blocking DB call)</w:t>
+        <w:t>Thread tăng = code đang block thread (sync wait, Task.Result, .Wait(), blocking DB call)</w:t>
       </w:r>
     </w:p>
     <w:p>
@@ -1682,7 +1682,7 @@
         <w:pStyle w:val="ListBullet"/>
       </w:pPr>
       <w:r>
-        <w:t>SQL Server voi 600 concurrent queries = connection pool max ~100 connections mac dinh</w:t>
+        <w:t>SQL Server với 600 concurrent queries = connection pool max ~100 connections mặc định</w:t>
       </w:r>
     </w:p>
     <w:p>
@@ -1690,7 +1690,7 @@
         <w:pStyle w:val="ListBullet"/>
       </w:pPr>
       <w:r>
-        <w:t>100 threads block cho DB + 500 request trong queue = P95 = 30s (dung voi screenshot)</w:t>
+        <w:t>100 threads block chờ DB + 500 request trong queue = P95 = 30s (đúng với screenshot)</w:t>
       </w:r>
     </w:p>
     <w:p>
@@ -1787,7 +1787,7 @@
           <w:color w:val="000080"/>
           <w:sz w:val="18"/>
         </w:rPr>
-        <w:t>// Trong connection string - tang pool size:</w:t>
+        <w:t>// Trong connection string - tăng pool size:</w:t>
       </w:r>
     </w:p>
     <w:p>
@@ -1810,12 +1810,12 @@
         <w:pStyle w:val="Heading3"/>
       </w:pPr>
       <w:r>
-        <w:t>Xac nhan fix:</w:t>
-      </w:r>
-    </w:p>
-    <w:p>
-      <w:r>
-        <w:t>Chay lai k6 voi cung VU. Thread count phai on dinh o muc thap du VU cao. P95 phai giam xuong duoi 500ms.</w:t>
+        <w:t>Xác nhận fix:</w:t>
+      </w:r>
+    </w:p>
+    <w:p>
+      <w:r>
+        <w:t>Chạy lại k6 với cùng VU. Thread count phải ổn định ở mức thấp dù VU cao. P95 phải giảm xuống dưới 500ms.</w:t>
       </w:r>
     </w:p>
     <w:p>
@@ -1823,12 +1823,12 @@
         <w:pStyle w:val="Heading2"/>
       </w:pPr>
       <w:r>
-        <w:t>4.4 Use Case: k6 Dashboard Trang Khong Co Data</w:t>
-      </w:r>
-    </w:p>
-    <w:p>
-      <w:r>
-        <w:t>Tinh huong: Chay k6 xong, vao Grafana nhung panel trang het.</w:t>
+        <w:t>4.4 Use Case: k6 Dashboard Trắng Không Có Data</w:t>
+      </w:r>
+    </w:p>
+    <w:p>
+      <w:r>
+        <w:t>Tình huống: Chạy k6 xong, vào Grafana nhưng panel trắng hết.</w:t>
       </w:r>
     </w:p>
     <w:p>
@@ -1836,7 +1836,7 @@
         <w:pStyle w:val="ListBullet"/>
       </w:pPr>
       <w:r>
-        <w:t>1. InfluxDB co data khong? curl -G http://localhost:8086/query --data-urlencode "db=k6" --data-urlencode "q=SHOW MEASUREMENTS"</w:t>
+        <w:t>1. InfluxDB có data không? curl -G http://localhost:8086/query --data-urlencode "db=k6" --data-urlencode "q=SHOW MEASUREMENTS"</w:t>
       </w:r>
     </w:p>
     <w:p>
@@ -1844,7 +1844,7 @@
         <w:pStyle w:val="ListBullet"/>
       </w:pPr>
       <w:r>
-        <w:t>2. Grafana co dung datasource khong? Admin -&gt; Data sources -&gt; influxdb -&gt; Test</w:t>
+        <w:t>2. Grafana có dùng datasource không? Admin -&gt; Data sources -&gt; influxdb -&gt; Test</w:t>
       </w:r>
     </w:p>
     <w:p>
@@ -1852,7 +1852,7 @@
         <w:pStyle w:val="ListBullet"/>
       </w:pPr>
       <w:r>
-        <w:t>3. Time range co dung khong? Chon "Last 1 hour" hoac "Last 6 hours"</w:t>
+        <w:t>3. Time range có đúng không? Chọn "Last 1 hour" hoặc "Last 6 hours"</w:t>
       </w:r>
     </w:p>
     <w:p>
@@ -1860,7 +1860,7 @@
         <w:pStyle w:val="ListBullet"/>
       </w:pPr>
       <w:r>
-        <w:t>4. k6 co dung --out influxdb=... khong? k6 khong tu dong ghi vao InfluxDB</w:t>
+        <w:t>4. k6 có dùng --out influxdb=... không? k6 không tự động ghi vào InfluxDB</w:t>
       </w:r>
     </w:p>
     <w:p>
@@ -1868,7 +1868,7 @@
         <w:pStyle w:val="ListBullet"/>
       </w:pPr>
       <w:r>
-        <w:t>5. Query co dung measurement name khong? Vao Explore -&gt; influxdb, test query trc</w:t>
+        <w:t>5. Query có đúng measurement name không? Vào Explore -&gt; influxdb, test query trước</w:t>
       </w:r>
     </w:p>
     <w:p>
@@ -1881,7 +1881,7 @@
     </w:p>
     <w:p>
       <w:r>
-        <w:t>Tinh huong: Dashboard API Target UP hien thi 0.</w:t>
+        <w:t>Tình huống: Dashboard API Target UP hiển thị 0.</w:t>
       </w:r>
     </w:p>
     <w:p>
@@ -1889,7 +1889,7 @@
         <w:pStyle w:val="ListBullet"/>
       </w:pPr>
       <w:r>
-        <w:t>1. API container co chay khong? docker ps | grep api</w:t>
+        <w:t>1. API container có chạy không? docker ps | grep api</w:t>
       </w:r>
     </w:p>
     <w:p>
@@ -1897,7 +1897,7 @@
         <w:pStyle w:val="ListBullet"/>
       </w:pPr>
       <w:r>
-        <w:t>2. /metrics co accessible khong? curl http://localhost:5000/metrics | head</w:t>
+        <w:t>2. /metrics có accessible không? curl http://localhost:5000/metrics | head</w:t>
       </w:r>
     </w:p>
     <w:p>
@@ -1905,7 +1905,7 @@
         <w:pStyle w:val="ListBullet"/>
       </w:pPr>
       <w:r>
-        <w:t>3. Prometheus config co dung target khong? cat prometheus/prometheus.yml</w:t>
+        <w:t>3. Prometheus config có đúng target không? cat prometheus/prometheus.yml</w:t>
       </w:r>
     </w:p>
     <w:p>
@@ -1913,7 +1913,7 @@
         <w:pStyle w:val="ListBullet"/>
       </w:pPr>
       <w:r>
-        <w:t>4. Prometheus co resolve duoc hostname khong? docker exec prometheus wget -qO- http://api:8080/metrics</w:t>
+        <w:t>4. Prometheus có resolve được hostname không? docker exec prometheus wget -qO- http://api:8080/metrics</w:t>
       </w:r>
     </w:p>
     <w:p>
@@ -1921,7 +1921,7 @@
         <w:pStyle w:val="ListBullet"/>
       </w:pPr>
       <w:r>
-        <w:t>5. Network co thong khong? docker network inspect bridge</w:t>
+        <w:t>5. Network có thông không? docker network inspect bridge</w:t>
       </w:r>
     </w:p>
     <w:p>
@@ -1935,7 +1935,7 @@
       </w:pPr>
       <w:r>
         <w:lastRenderedPageBreak/>
-        <w:t>CHUONG 5: CHECKLIST VA THUC HANH HANG NGAY</w:t>
+        <w:t>CHƯƠNG 5: CHECKLIST VÀ THỰC HÀNH HÀNG NGÀY</w:t>
       </w:r>
     </w:p>
     <w:p>
@@ -1951,7 +1951,7 @@
         <w:pStyle w:val="ListBullet"/>
       </w:pPr>
       <w:r>
-        <w:t>[ ] Chay smoke test k6 (10 VU, 1 phut) -&gt; P95 duoi 500ms, Error = 0%</w:t>
+        <w:t>[ ] Chạy smoke test k6 (10 VU, 1 phút) -&gt; P95 dưới 500ms, Error = 0%</w:t>
       </w:r>
     </w:p>
     <w:p>
@@ -1959,7 +1959,7 @@
         <w:pStyle w:val="ListBullet"/>
       </w:pPr>
       <w:r>
-        <w:t>[ ] Chay load test k6 (100 VU, 5 phut) -&gt; P95 duoi 2s, Error duoi 0.1%</w:t>
+        <w:t>[ ] Chạy load test k6 (100 VU, 5 phút) -&gt; P95 dưới 2s, Error dưới 0.1%</w:t>
       </w:r>
     </w:p>
     <w:p>
@@ -1967,7 +1967,7 @@
         <w:pStyle w:val="ListBullet"/>
       </w:pPr>
       <w:r>
-        <w:t>[ ] Kiem tra memory khong tang sau 5 phut chiu tai</w:t>
+        <w:t>[ ] Kiểm tra memory không tăng sau 5 phút chịu tải</w:t>
       </w:r>
     </w:p>
     <w:p>
@@ -1975,7 +1975,7 @@
         <w:pStyle w:val="ListBullet"/>
       </w:pPr>
       <w:r>
-        <w:t>[ ] Kiem tra Thread count on dinh</w:t>
+        <w:t>[ ] Kiểm tra Thread count ổn định</w:t>
       </w:r>
     </w:p>
     <w:p>
@@ -1991,7 +1991,7 @@
         <w:pStyle w:val="ListBullet"/>
       </w:pPr>
       <w:r>
-        <w:t>[ ] Alert rules da configured</w:t>
+        <w:t>[ ] Alert rules đã configured</w:t>
       </w:r>
     </w:p>
     <w:p>
@@ -2007,7 +2007,7 @@
         <w:pStyle w:val="ListBullet"/>
       </w:pPr>
       <w:r>
-        <w:t>[ ] Xem Grafana 15 phut sau deploy</w:t>
+        <w:t>[ ] Xem Grafana 15 phút sau deploy</w:t>
       </w:r>
     </w:p>
     <w:p>
@@ -2015,7 +2015,7 @@
         <w:pStyle w:val="ListBullet"/>
       </w:pPr>
       <w:r>
-        <w:t>[ ] Verify P95 khong tang so voi truoc deploy</w:t>
+        <w:t>[ ] Verify P95 không tăng so với trước deploy</w:t>
       </w:r>
     </w:p>
     <w:p>
@@ -2023,7 +2023,7 @@
         <w:pStyle w:val="ListBullet"/>
       </w:pPr>
       <w:r>
-        <w:t>[ ] Verify Error Rate khong tang</w:t>
+        <w:t>[ ] Verify Error Rate không tăng</w:t>
       </w:r>
     </w:p>
     <w:p>
@@ -2031,7 +2031,7 @@
         <w:pStyle w:val="ListBullet"/>
       </w:pPr>
       <w:r>
-        <w:t>[ ] Verify Memory trend khong bat thuong</w:t>
+        <w:t>[ ] Verify Memory trend không bất thường</w:t>
       </w:r>
     </w:p>
     <w:p>
@@ -2039,7 +2039,7 @@
         <w:pStyle w:val="Heading2"/>
       </w:pPr>
       <w:r>
-        <w:t>5.3 Danh Muc k6 Scripts Can Co</w:t>
+        <w:t>5.3 Danh Mục k6 Scripts Cần Có</w:t>
       </w:r>
     </w:p>
     <w:p>
@@ -2048,7 +2048,7 @@
           <w:b/>
           <w:i/>
         </w:rPr>
-        <w:t>Bang 3: Danh muc k6 scripts can co trong project</w:t>
+        <w:t>Bảng 3: Danh mục k6 scripts cần có trong project</w:t>
       </w:r>
     </w:p>
     <w:tbl>
@@ -2099,7 +2099,7 @@
               <w:rPr>
                 <w:b/>
               </w:rPr>
-              <w:t>Muc dich</w:t>
+              <w:t>Mục đích</w:t>
             </w:r>
           </w:p>
         </w:tc>
@@ -2161,7 +2161,7 @@
           </w:tcPr>
           <w:p>
             <w:r>
-              <w:t>Verify API hoat dong sau deploy</w:t>
+              <w:t>Verify API hoạt động sau deploy</w:t>
             </w:r>
           </w:p>
         </w:tc>
@@ -2183,7 +2183,7 @@
           </w:tcPr>
           <w:p>
             <w:r>
-              <w:t>1-2 phut</w:t>
+              <w:t>1-2 phút</w:t>
             </w:r>
           </w:p>
         </w:tc>
@@ -2229,7 +2229,7 @@
           </w:tcPr>
           <w:p>
             <w:r>
-              <w:t>10-15 phut</w:t>
+              <w:t>10-15 phút</w:t>
             </w:r>
           </w:p>
         </w:tc>
@@ -2253,7 +2253,7 @@
           </w:tcPr>
           <w:p>
             <w:r>
-              <w:t>Tim breaking point, capacity planning</w:t>
+              <w:t>Tìm breaking point, capacity planning</w:t>
             </w:r>
           </w:p>
         </w:tc>
@@ -2275,7 +2275,7 @@
           </w:tcPr>
           <w:p>
             <w:r>
-              <w:t>20-30 phut</w:t>
+              <w:t>20-30 phút</w:t>
             </w:r>
           </w:p>
         </w:tc>
@@ -2299,7 +2299,7 @@
           </w:tcPr>
           <w:p>
             <w:r>
-              <w:t>Test hanh vi khi traffic dot bien</w:t>
+              <w:t>Test hành vi khi traffic đột biến</w:t>
             </w:r>
           </w:p>
         </w:tc>
@@ -2321,7 +2321,7 @@
           </w:tcPr>
           <w:p>
             <w:r>
-              <w:t>5 phut</w:t>
+              <w:t>5 phút</w:t>
             </w:r>
           </w:p>
         </w:tc>
@@ -2345,7 +2345,7 @@
           </w:tcPr>
           <w:p>
             <w:r>
-              <w:t>Test memory leak qua thoi gian dai</w:t>
+              <w:t>Test memory leak qua thời gian dài</w:t>
             </w:r>
           </w:p>
         </w:tc>
@@ -2367,7 +2367,7 @@
           </w:tcPr>
           <w:p>
             <w:r>
-              <w:t>1-2 gio</w:t>
+              <w:t>1-2 giờ</w:t>
             </w:r>
           </w:p>
         </w:tc>
@@ -2383,7 +2383,7 @@
       </w:r>
       <w:r>
         <w:lastRenderedPageBreak/>
-        <w:t>CHUONG 6: PANELS NANG CAO NEN THEM VAO DASHBOARD</w:t>
+        <w:t>CHƯƠNG 6: PANELS NÂNG CAO NÊN THÊM VÀO DASHBOARD</w:t>
       </w:r>
     </w:p>
     <w:p>
@@ -2396,7 +2396,7 @@
     </w:p>
     <w:p>
       <w:r>
-        <w:t>Panel nay giup phat hien memory pressure va GC storm - khi GC chay qua nhieu lam cham ung dung.</w:t>
+        <w:t>Panel này giúp phát hiện memory pressure và GC storm - khi GC chạy quá nhiều làm chậm ứng dụng.</w:t>
       </w:r>
     </w:p>
     <w:p>
@@ -2431,7 +2431,7 @@
     </w:p>
     <w:p>
       <w:r>
-        <w:t>gen0 thuong xuyen = OK (thu gom object ngan han). gen2 nhieu = memory pressure nghiem trong.</w:t>
+        <w:t>gen0 thường xuyên = OK (thu gom object ngắn hạn). gen2 nhiều = memory pressure nghiêm trọng.</w:t>
       </w:r>
     </w:p>
     <w:p>
@@ -2444,7 +2444,7 @@
     </w:p>
     <w:p>
       <w:r>
-        <w:t>Phan biet loai loi: 4xx la loi phia client, 5xx la loi phia server.</w:t>
+        <w:t>Phân biệt loại lỗi: 4xx là lỗi phía client, 5xx là lỗi phía server.</w:t>
       </w:r>
     </w:p>
     <w:p>
@@ -2472,7 +2472,7 @@
     </w:p>
     <w:p>
       <w:r>
-        <w:t>Khi queue &gt; 0 keo dai nghia la ThreadPool da bao hoa, request dang xep hang cho thread.</w:t>
+        <w:t>Khi queue &gt; 0 kéo dài nghĩa là ThreadPool đã bão hòa, request đang xếp hàng chờ thread.</w:t>
       </w:r>
     </w:p>
     <w:p>
@@ -2495,7 +2495,7 @@
         <w:pStyle w:val="Heading2"/>
       </w:pPr>
       <w:r>
-        <w:t>6.4 k6 Iteration Duration (chinh xac hon Average)</w:t>
+        <w:t>6.4 k6 Iteration Duration (chính xác hơn Average)</w:t>
       </w:r>
     </w:p>
     <w:p>
@@ -2538,7 +2538,7 @@
     </w:p>
     <w:p>
       <w:r>
-        <w:t>Thoi gian GC dung ung dung de collect garbage. Gen2 GC pause &gt; 100ms = user cam nhan gian doan.</w:t>
+        <w:t>Thời gian GC dừng ứng dụng để collect garbage. Gen2 GC pause &gt; 100ms = user cảm nhận gián đoạn.</w:t>
       </w:r>
     </w:p>
     <w:p>
@@ -2575,7 +2575,7 @@
       </w:pPr>
       <w:r>
         <w:lastRenderedPageBreak/>
-        <w:t>CHUONG 7: QUICK REFERENCE</w:t>
+        <w:t>CHƯƠNG 7: QUICK REFERENCE</w:t>
       </w:r>
     </w:p>
     <w:p>
@@ -2583,7 +2583,7 @@
         <w:pStyle w:val="Heading2"/>
       </w:pPr>
       <w:r>
-        <w:t>7.1 Flow Doc Dashboard Khi Incident (30 giay)</w:t>
+        <w:t>7.1 Flow Đọc Dashboard Khi Incident (30 giây)</w:t>
       </w:r>
     </w:p>
     <w:p>
@@ -2591,7 +2591,7 @@
         <w:pStyle w:val="ListBullet"/>
       </w:pPr>
       <w:r>
-        <w:t>STEP 1: API Target UP = 1? -&gt; Neu = 0: API down, restart ngay</w:t>
+        <w:t>STEP 1: API Target UP = 1? -&gt; Nếu = 0: API down, restart ngay</w:t>
       </w:r>
     </w:p>
     <w:p>
@@ -2599,7 +2599,7 @@
         <w:pStyle w:val="ListBullet"/>
       </w:pPr>
       <w:r>
-        <w:t>STEP 2: Error Rate? -&gt; Neu tren 1%: co 5xx errors, xem log ngay</w:t>
+        <w:t>STEP 2: Error Rate? -&gt; Nếu trên 1%: có 5xx errors, xem log ngay</w:t>
       </w:r>
     </w:p>
     <w:p>
@@ -2607,7 +2607,7 @@
         <w:pStyle w:val="ListBullet"/>
       </w:pPr>
       <w:r>
-        <w:t>STEP 3: P95 Response Time? -&gt; Neu tren 2s: performance degradation</w:t>
+        <w:t>STEP 3: P95 Response Time? -&gt; Nếu trên 2s: performance degradation</w:t>
       </w:r>
     </w:p>
     <w:p>
@@ -2615,7 +2615,7 @@
         <w:pStyle w:val="ListBullet"/>
       </w:pPr>
       <w:r>
-        <w:t>STEP 4: Thread Count trend? -&gt; Neu tang lien tuc: blocking I/O</w:t>
+        <w:t>STEP 4: Thread Count trend? -&gt; Nếu tăng liên tục: blocking I/O</w:t>
       </w:r>
     </w:p>
     <w:p>
@@ -2623,7 +2623,7 @@
         <w:pStyle w:val="ListBullet"/>
       </w:pPr>
       <w:r>
-        <w:t>STEP 5: Memory trend? -&gt; Neu tang khong giam: memory leak</w:t>
+        <w:t>STEP 5: Memory trend? -&gt; Nếu tăng không giảm: memory leak</w:t>
       </w:r>
     </w:p>
     <w:p>
@@ -2631,7 +2631,7 @@
         <w:pStyle w:val="ListBullet"/>
       </w:pPr>
       <w:r>
-        <w:t>STEP 6: RPS vs VU ratio? -&gt; Neu RPS plateau khi VU tang: bottleneck</w:t>
+        <w:t>STEP 6: RPS vs VU ratio? -&gt; Nếu RPS plateau khi VU tăng: bottleneck</w:t>
       </w:r>
     </w:p>
     <w:p>
@@ -2639,7 +2639,7 @@
         <w:pStyle w:val="Heading2"/>
       </w:pPr>
       <w:r>
-        <w:t>7.2 Khi Nao Call On-Call Engineer</w:t>
+        <w:t>7.2 Khi Nào Call On-Call Engineer</w:t>
       </w:r>
     </w:p>
     <w:p>
@@ -2648,7 +2648,7 @@
           <w:b/>
           <w:color w:val="FF0000"/>
         </w:rPr>
-        <w:t>[CANH BAO] CALL NGAY: API Target DOWN tren 1 phut</w:t>
+        <w:t>[CẢNH BÁO] CALL NGAY: API Target DOWN trên 1 phút</w:t>
       </w:r>
     </w:p>
     <w:p>
@@ -2657,7 +2657,7 @@
           <w:b/>
           <w:color w:val="FF0000"/>
         </w:rPr>
-        <w:t>[CANH BAO] CALL NGAY: Error Rate tren 5% keo dai tren 2 phut</w:t>
+        <w:t>[CẢNH BÁO] CALL NGAY: Error Rate trên 5% kéo dài trên 2 phút</w:t>
       </w:r>
     </w:p>
     <w:p>
@@ -2666,7 +2666,7 @@
           <w:b/>
           <w:color w:val="FF0000"/>
         </w:rPr>
-        <w:t>[CANH BAO] CALL NGAY: P95 tren 10s keo dai tren 3 phut trong production</w:t>
+        <w:t>[CẢNH BÁO] CALL NGAY: P95 trên 10s kéo dài trên 3 phút trong production</w:t>
       </w:r>
     </w:p>
     <w:p>
@@ -2675,12 +2675,12 @@
           <w:b/>
           <w:color w:val="FF0000"/>
         </w:rPr>
-        <w:t>[CANH BAO] CALL NGAY: Memory tang tren 80% container memory limit</w:t>
-      </w:r>
-    </w:p>
-    <w:p>
-      <w:r>
-        <w:t>INVESTIGATE (khong can call ngay): P95 tu 2-5s, Thread tang dan, GC rate cao.</w:t>
+        <w:t>[CẢNH BÁO] CALL NGAY: Memory tăng trên 80% container memory limit</w:t>
+      </w:r>
+    </w:p>
+    <w:p>
+      <w:r>
+        <w:t>INVESTIGATE (không cần call ngay): P95 từ 2-5s, Thread tăng dần, GC rate cao.</w:t>
       </w:r>
     </w:p>
     <w:p>
@@ -2697,7 +2697,7 @@
           <w:b/>
           <w:i/>
         </w:rPr>
-        <w:t>Bang 4: PromQL Cheat Sheet</w:t>
+        <w:t>Bảng 4: PromQL Cheat Sheet</w:t>
       </w:r>
     </w:p>
     <w:tbl>
@@ -2727,7 +2727,7 @@
               <w:rPr>
                 <w:b/>
               </w:rPr>
-              <w:t>Muc dich</w:t>
+              <w:t>Mục đích</w:t>
             </w:r>
           </w:p>
         </w:tc>
@@ -2759,7 +2759,7 @@
           </w:tcPr>
           <w:p>
             <w:r>
-              <w:t>API co UP khong</w:t>
+              <w:t>API có UP không</w:t>
             </w:r>
           </w:p>
         </w:tc>
@@ -2783,7 +2783,7 @@
           </w:tcPr>
           <w:p>
             <w:r>
-              <w:t>Request rate 1 phut</w:t>
+              <w:t>Request rate 1 phút</w:t>
             </w:r>
           </w:p>
         </w:tc>
@@ -2807,7 +2807,7 @@
           </w:tcPr>
           <w:p>
             <w:r>
-              <w:t>P95 latency 5 phut</w:t>
+              <w:t>P95 latency 5 phút</w:t>
             </w:r>
           </w:p>
         </w:tc>
@@ -2982,7 +2982,7 @@
                 <w:b/>
                 <w:i/>
               </w:rPr>
-              <w:t xml:space="preserve">Bang 5: InfluxQL Cheat Sheet cho </w:t>
+              <w:t xml:space="preserve">Bảng 5: InfluxQL Cheat Sheet cho </w:t>
             </w:r>
             <w:r>
               <w:t>k6</w:t>
@@ -3015,7 +3015,7 @@
                     <w:rPr>
                       <w:b/>
                     </w:rPr>
-                    <w:t>Muc dich</w:t>
+                    <w:t>Mục đích</w:t>
                   </w:r>
                 </w:p>
               </w:tc>
@@ -3080,7 +3080,7 @@
                     <w:outlineLvl w:val="1"/>
                   </w:pPr>
                   <w:r>
-                    <w:t>7.5 So Sanh 2 Nguon Data</w:t>
+                    <w:t>7.5 So Sánh 2 Nguồn Data</w:t>
                   </w:r>
                 </w:p>
                 <w:p>
@@ -3089,7 +3089,7 @@
                       <w:b/>
                       <w:i/>
                     </w:rPr>
-                    <w:t xml:space="preserve">Bang 6: So sanh 2 nguon data - khi nao </w:t>
+                    <w:t xml:space="preserve">Bảng 6: So sánh 2 nguồn data - khi nào </w:t>
                   </w:r>
                   <w:r>
                     <w:rPr>
@@ -3097,10 +3097,10 @@
                       <w:i/>
                     </w:rPr>
                     <w:lastRenderedPageBreak/>
-                    <w:t xml:space="preserve">dung cai </w:t>
+                    <w:t xml:space="preserve">dùng cái </w:t>
                   </w:r>
                   <w:r>
-                    <w:t>nao</w:t>
+                    <w:t>nào</w:t>
                   </w:r>
                 </w:p>
                 <w:tbl>
@@ -3189,7 +3189,7 @@
                           <w:rPr>
                             <w:b/>
                           </w:rPr>
-                          <w:t>Dung khi nao</w:t>
+                          <w:t>Dùng khi nào</w:t>
                         </w:r>
                       </w:p>
                     </w:tc>
@@ -3219,7 +3219,7 @@
                             <w:i/>
                             <w:sz w:val="18"/>
                           </w:rPr>
-                          <w:t>Tai lieu nay duoc tao tu thuc te lab: k6 + Infl</w:t>
+                          <w:t>Tài liệu này được tạo từ thực tế lab: k6 + Infl</w:t>
                         </w:r>
                         <w:r>
                           <w:rPr>
@@ -3255,7 +3255,7 @@
                       <w:p>
                         <w:r>
                           <w:lastRenderedPageBreak/>
-                          <w:t>Goc nhin client (network included)</w:t>
+                          <w:t>Góc nhìn client (network included)</w:t>
                         </w:r>
                       </w:p>
                     </w:tc>
@@ -3266,7 +3266,7 @@
                       </w:tcPr>
                       <w:p>
                         <w:r>
-                          <w:t>Goc nhin server (processing only)</w:t>
+                          <w:t>Góc nhìn server (processing only)</w:t>
                         </w:r>
                       </w:p>
                     </w:tc>
@@ -3277,11 +3277,11 @@
                       </w:tcPr>
                       <w:p>
                         <w:r>
-                          <w:t>So sanh hai gia tri de biet overhead m</w:t>
+                          <w:t>So sánh hai giá trị để biết overhead m</w:t>
                         </w:r>
                         <w:r>
                           <w:lastRenderedPageBreak/>
-                          <w:t>ang</w:t>
+                          <w:t>ạng</w:t>
                         </w:r>
                       </w:p>
                     </w:tc>
@@ -3328,7 +3328,7 @@
                       </w:tcPr>
                       <w:p>
                         <w:r>
-                          <w:t>Phat hien drop truoc khi vao API</w:t>
+                          <w:t>Phát hiện drop trước khi vào API</w:t>
                         </w:r>
                       </w:p>
                     </w:tc>
@@ -3375,7 +3375,7 @@
                       </w:tcPr>
                       <w:p>
                         <w:r>
-                          <w:t>Cross-validate nguon loi</w:t>
+                          <w:t>Cross-validate nguồn lỗi</w:t>
                         </w:r>
                       </w:p>
                     </w:tc>
@@ -3399,7 +3399,7 @@
                       </w:tcPr>
                       <w:p>
                         <w:r>
-                          <w:t>Khong co trong k6</w:t>
+                          <w:t>Không có trong k6</w:t>
                         </w:r>
                       </w:p>
                     </w:tc>
@@ -3421,7 +3421,7 @@
                       </w:tcPr>
                       <w:p>
                         <w:r>
-                          <w:t>Correlation voi lat khi load cao</w:t>
+                          <w:t>Correlation với lat khi load cao</w:t>
                         </w:r>
                       </w:p>
                     </w:tc>
@@ -3446,7 +3446,7 @@
                       </w:tcPr>
                       <w:p>
                         <w:r>
-                          <w:t>Khong co trong k6</w:t>
+                          <w:t>Không có trong k6</w:t>
                         </w:r>
                       </w:p>
                     </w:tc>
@@ -3468,7 +3468,7 @@
                       </w:tcPr>
                       <w:p>
                         <w:r>
-                          <w:t>Phat hien blocking I/O pattern</w:t>
+                          <w:t>Phát hiện blocking I/O pattern</w:t>
                         </w:r>
                       </w:p>
                     </w:tc>
@@ -3616,7 +3616,7 @@
               <w:outlineLvl w:val="1"/>
             </w:pPr>
             <w:r>
-              <w:t>5.4 Commands Thuong Dung Khi Incident</w:t>
+              <w:t>5.4 Commands Thường Dùng Khi Incident</w:t>
             </w:r>
           </w:p>
           <w:p>
@@ -3631,7 +3631,7 @@
                 <w:color w:val="000080"/>
                 <w:sz w:val="18"/>
               </w:rPr>
-              <w:t># Xem container resource ngay lap tuc:</w:t>
+              <w:t># Xem container resource ngay lập tức:</w:t>
             </w:r>
           </w:p>
           <w:p>
@@ -3816,7 +3816,7 @@
                 <w:color w:val="000080"/>
                 <w:sz w:val="18"/>
               </w:rPr>
-              <w:t># Check InfluxDB co data khong:</w:t>
+              <w:t># Check InfluxDB có data không:</w:t>
             </w:r>
           </w:p>
           <w:p>
@@ -3847,16 +3847,16 @@
               <w:outlineLvl w:val="1"/>
             </w:pPr>
             <w:r>
-              <w:t>3.2 Log Correlation - Tim Root Cause</w:t>
-            </w:r>
-          </w:p>
-          <w:p>
-            <w:r>
-              <w:t xml:space="preserve">Khi dashboard bao loi, buoc tiep theo la xem log de biet chinh xac </w:t>
+              <w:t>3.2 Log Correlation - Tìm Root Cause</w:t>
+            </w:r>
+          </w:p>
+          <w:p>
+            <w:r>
+              <w:t xml:space="preserve">Khi dashboard báo lỗi, bước tiếp theo là xem log để biết chính xác </w:t>
             </w:r>
             <w:r>
               <w:lastRenderedPageBreak/>
-              <w:t>exception nao xay ra.</w:t>
+              <w:t>exception nào xảy ra.</w:t>
             </w:r>
           </w:p>
           <w:p>
@@ -3864,7 +3864,7 @@
               <w:pStyle w:val="ListBullet"/>
             </w:pPr>
             <w:r>
-              <w:t>Buoc 1: Dashboard bao P95 tang luc 11:52</w:t>
+              <w:t>Bước 1: Dashboard báo P95 tăng lúc 11:52</w:t>
             </w:r>
           </w:p>
           <w:p>
@@ -3872,7 +3872,7 @@
               <w:pStyle w:val="ListBullet"/>
             </w:pPr>
             <w:r>
-              <w:t>Buoc 2: docker logs api --since 2026-06-04T11:50:00 --until 2026-06-04T11:55:00</w:t>
+              <w:t>Bước 2: docker logs api --since 2026-06-04T11:50:00 --until 2026-06-04T11:55:00</w:t>
             </w:r>
           </w:p>
           <w:p>
@@ -3880,7 +3880,7 @@
               <w:pStyle w:val="ListBullet"/>
             </w:pPr>
             <w:r>
-              <w:t>Buoc 3: Tim pattern ERROR, SqlException, Timeout, Thread</w:t>
+              <w:t>Bước 3: Tìm pattern ERROR, SqlException, Timeout, Thread</w:t>
             </w:r>
           </w:p>
           <w:p>
@@ -3888,7 +3888,7 @@
               <w:pStyle w:val="ListBullet"/>
             </w:pPr>
             <w:r>
-              <w:t>Buoc 4: Correlate voi Prometheus metric cung timestamp</w:t>
+              <w:t>Bước 4: Correlate với Prometheus metric cùng timestamp</w:t>
             </w:r>
           </w:p>
           <w:p>
@@ -3928,7 +3928,7 @@
                 <w:color w:val="auto"/>
                 <w:sz w:val="22"/>
               </w:rPr>
-              <w:t>3.3 Distributed Tracing - Tim Endpoint Cham</w:t>
+              <w:t>3.3 Distributed Tracing - Tìm Endpoint Chậm</w:t>
             </w:r>
           </w:p>
           <w:p>
@@ -3941,7 +3941,7 @@
               <w:rPr>
                 <w:rFonts w:ascii="Calibri" w:hAnsi="Calibri" w:cs="Calibri"/>
               </w:rPr>
-              <w:t>Tich hop OpenTelemetry de trace tung request end-to-end, biet chinh xac line code nao cham.</w:t>
+              <w:t>Tích hợp OpenTelemetry để trace từng request end-to-end, biết chính xác line code nào chậm.</w:t>
             </w:r>
           </w:p>
           <w:p>
@@ -3952,7 +3952,7 @@
               <w:rPr>
                 <w:rFonts w:ascii="Calibri" w:hAnsi="Calibri" w:cs="Calibri"/>
               </w:rPr>
-              <w:t>Tool: Jaeger (open source) hoac Zipkin - chay them container</w:t>
+              <w:t>Tool: Jaeger (open source) hoặc Zipkin - chạy thêm container</w:t>
             </w:r>
           </w:p>
           <w:p>
@@ -3981,7 +3981,7 @@
               <w:rPr>
                 <w:rFonts w:ascii="Calibri" w:hAnsi="Calibri" w:cs="Calibri"/>
               </w:rPr>
-              <w:t>Khi co trace: moi request hien waterfall diagram, thay DB query mat bao ms</w:t>
+              <w:t>Khi có trace: mỗi request hiện waterfall diagram, thấy DB query mất bao ms</w:t>
             </w:r>
           </w:p>
           <w:p>
@@ -3992,7 +3992,7 @@
               <w:rPr>
                 <w:rFonts w:ascii="Calibri" w:hAnsi="Calibri" w:cs="Calibri"/>
               </w:rPr>
-              <w:t>Correlation: Trace ID co the link sang Grafana Explore de xem log cung luc</w:t>
+              <w:t>Correlation: Trace ID có thể link sang Grafana Explore để xem log cùng lúc</w:t>
             </w:r>
           </w:p>
           <w:p>
@@ -4007,7 +4007,7 @@
               <w:rPr>
                 <w:rFonts w:ascii="Calibri" w:hAnsi="Calibri" w:cs="Calibri"/>
               </w:rPr>
-              <w:t>3.4 Capacity Planning - Dung Data De Quyet Dinh Scale</w:t>
+              <w:t>3.4 Capacity Planning - Dùng Data Để Quyết Định Scale</w:t>
             </w:r>
           </w:p>
           <w:p>
@@ -4020,7 +4020,7 @@
               <w:rPr>
                 <w:rFonts w:ascii="Calibri" w:hAnsi="Calibri" w:cs="Calibri"/>
               </w:rPr>
-              <w:t>Technical Leader dung load test data de tra loi: "He thong nay chiu duoc bao nhieu user thuc su?"</w:t>
+              <w:t>Technical Leader dùng load test data để trả lời: "Hệ thống này chịu được bao nhiêu user thực sự?"</w:t>
             </w:r>
           </w:p>
           <w:p>
@@ -4031,7 +4031,7 @@
               <w:rPr>
                 <w:rFonts w:ascii="Calibri" w:hAnsi="Calibri" w:cs="Calibri"/>
               </w:rPr>
-              <w:t>Chay stress test: ramp tu 0 -&gt; 1000 VU trong 20 phut</w:t>
+              <w:t>Chạy stress test: ramp từ 0 -&gt; 1000 VU trong 20 phút</w:t>
             </w:r>
           </w:p>
           <w:p>
@@ -4042,7 +4042,7 @@
               <w:rPr>
                 <w:rFonts w:ascii="Calibri" w:hAnsi="Calibri" w:cs="Calibri"/>
               </w:rPr>
-              <w:t>Xac dinh breaking point: VU tai do P95 vuot 2s lan dau tien</w:t>
+              <w:t>Xác định breaking point: VU tại đó P95 vượt 2s lần đầu tiên</w:t>
             </w:r>
           </w:p>
           <w:p>
@@ -4053,7 +4053,7 @@
               <w:rPr>
                 <w:rFonts w:ascii="Calibri" w:hAnsi="Calibri" w:cs="Calibri"/>
               </w:rPr>
-              <w:t xml:space="preserve">Ap dung safety factor 60-70%: breaking point = 300 VU -&gt; </w:t>
+              <w:t xml:space="preserve">Áp dụng safety factor 60-70%: breaking point = 300 VU -&gt; </w:t>
             </w:r>
             <w:r>
               <w:rPr>
@@ -4071,7 +4071,7 @@
               <w:rPr>
                 <w:rFonts w:ascii="Calibri" w:hAnsi="Calibri" w:cs="Calibri"/>
               </w:rPr>
-              <w:t>Estimate concurrent users thuc te: 10% peak traffic = simultaneous requests</w:t>
+              <w:t>Estimate concurrent users thực tế: 10% peak traffic = simultaneous requests</w:t>
             </w:r>
           </w:p>
           <w:p>
@@ -4082,7 +4082,7 @@
               <w:rPr>
                 <w:rFonts w:ascii="Calibri" w:hAnsi="Calibri" w:cs="Calibri"/>
               </w:rPr>
-              <w:t>Tinh so replicas: neu 1 instance chiu 200 VU, can 3 instances cho 600 peak users</w:t>
+              <w:t>Tính số replicas: nếu 1 instance chịu 200 VU, cần 3 instances cho 600 peak users</w:t>
             </w:r>
           </w:p>
           <w:p>
@@ -4110,7 +4110,7 @@
               <w:rPr>
                 <w:rFonts w:ascii="Calibri" w:hAnsi="Calibri" w:cs="Calibri"/>
               </w:rPr>
-              <w:t>SLO (Service Level Objective) la cam ket ve chat luong dich vu. Vi du: 99.9% request hoan thanh duoi 500ms.</w:t>
+              <w:t>SLO (Service Level Objective) là cam kết về chất lượng dịch vụ. Ví dụ: 99.9% request hoàn thành dưới 500ms.</w:t>
             </w:r>
           </w:p>
           <w:p>
@@ -4271,7 +4271,7 @@
               <w:t>2</w:t>
             </w:r>
             <w:r>
-              <w:t>.3 Nhan Biet Pattern Van De</w:t>
+              <w:t>.3 Nhận Biết Pattern Vấn Đề</w:t>
             </w:r>
           </w:p>
           <w:p>
@@ -4286,7 +4286,7 @@
           </w:p>
           <w:p>
             <w:r>
-              <w:t>Dau hieu: P95 tang dan theo thoi gian du VU khong doi. Nguyen nhan: memory leak, connection leak, cache miss tich luy.</w:t>
+              <w:t>Dấu hiệu: P95 tăng dần theo thời gian dù VU không đổi. Nguyên nhân: memory leak, connection leak, cache miss tích lũy.</w:t>
             </w:r>
           </w:p>
           <w:p>
@@ -4294,7 +4294,7 @@
               <w:pStyle w:val="ListBullet"/>
             </w:pPr>
             <w:r>
-              <w:t>Xem process_resident_memory_bytes - neu tang lien tuc khong giam = memory leak</w:t>
+              <w:t>Xem process_resident_memory_bytes - nếu tăng liên tục không giảm = memory leak</w:t>
             </w:r>
           </w:p>
           <w:p>
@@ -4324,12 +4324,12 @@
               <w:outlineLvl w:val="2"/>
             </w:pPr>
             <w:r>
-              <w:t>Pattern 2: Cliff Drop (Sup Do Dot Ngot)</w:t>
-            </w:r>
-          </w:p>
-          <w:p>
-            <w:r>
-              <w:t>Dau hieu: RPS dot ngot giam 80-100%, Error Rate tang vot, API Target DOWN. Nguyen nhan: OOM Kill, crash, DB lost.</w:t>
+              <w:t>Pattern 2: Cliff Drop (Sụp Đổ Đột Ngột)</w:t>
+            </w:r>
+          </w:p>
+          <w:p>
+            <w:r>
+              <w:t>Dấu hiệu: RPS đột ngột giảm 80-100%, Error Rate tăng vọt, API Target DOWN. Nguyên nhân: OOM Kill, crash, DB lost.</w:t>
             </w:r>
           </w:p>
           <w:p>
@@ -4353,16 +4353,16 @@
               <w:outlineLvl w:val="2"/>
             </w:pPr>
             <w:r>
-              <w:t>Pattern 3: Thread Exhaustion (nhu screenshot cua ban)</w:t>
-            </w:r>
-          </w:p>
-          <w:p>
-            <w:r>
-              <w:t xml:space="preserve">Dau hieu: Thread tang lien tuc, P95 tang theo bac </w:t>
+              <w:t>Pattern 3: Thread Exhaustion (như screenshot của bạn)</w:t>
+            </w:r>
+          </w:p>
+          <w:p>
+            <w:r>
+              <w:t xml:space="preserve">Dấu hiệu: Thread tăng liên tục, P95 </w:t>
             </w:r>
             <w:r>
               <w:lastRenderedPageBreak/>
-              <w:t>thang, RPS plateau. Nguyen nhan: DB query cham blocking threads.</w:t>
+              <w:t>tăng theo bậc thang, RPS plateau. Nguyên nhân: DB query chậm blocking threads.</w:t>
             </w:r>
           </w:p>
           <w:p>
@@ -4397,7 +4397,7 @@
           </w:p>
           <w:p>
             <w:r>
-              <w:t>Dau hieu: P95 cao bat thuong trong khi Average van thap. Mot so request dac biet cham (cold start, cache miss).</w:t>
+              <w:t>Dấu hiệu: P95 cao bất thường trong khi Average vẫn thấp. Một số request đặc biệt chậm (cold start, cache miss).</w:t>
             </w:r>
           </w:p>
           <w:p>
@@ -4438,7 +4438,7 @@
           <w:p>
             <w:r>
               <w:lastRenderedPageBreak/>
-              <w:t>duoi 200ms</w:t>
+              <w:t>dưới 200ms</w:t>
             </w:r>
           </w:p>
         </w:tc>
@@ -4460,7 +4460,7 @@
           </w:tcPr>
           <w:p>
             <w:r>
-              <w:t>tren 1s</w:t>
+              <w:t>trên 1s</w:t>
             </w:r>
           </w:p>
         </w:tc>
@@ -4489,12 +4489,12 @@
       </w:pPr>
       <w:r>
         <w:lastRenderedPageBreak/>
-        <w:t>CHUONG 8: PHAN TICH THUC TE - KET QUA LOAD TEST 1000 VU</w:t>
-      </w:r>
-    </w:p>
-    <w:p>
-      <w:r>
-        <w:t>Phan nay phan tich ket qua thuc te cua bai chay load-test.js tren he thong AuthDemo voi 1000 Virtual Users (ramp 5 giai doan trong 13 phut). Day la case study thuc te de hieu cach doc va xu ly ket qua k6.</w:t>
+        <w:t>CHƯƠNG 8: PHÂN TÍCH THỰC TẾ - KẾT QUẢ LOAD TEST 1000 VU</w:t>
+      </w:r>
+    </w:p>
+    <w:p>
+      <w:r>
+        <w:t>Phần này phân tích kết quả thực tế của bài chạy load-test.js trên hệ thống AuthDemo với 1000 Virtual Users (ramp 5 giai đoạn trong 13 phút). Đây là case study thực tế để hiểu cách đọc và xử lý kết quả k6.</w:t>
       </w:r>
     </w:p>
     <w:p>
@@ -4502,7 +4502,7 @@
         <w:pStyle w:val="Heading2"/>
       </w:pPr>
       <w:r>
-        <w:t>8.1 Cau Hinh Bai Test</w:t>
+        <w:t>8.1 Cấu Hình Bài Test</w:t>
       </w:r>
     </w:p>
     <w:p>
@@ -4511,7 +4511,7 @@
           <w:b/>
           <w:i/>
         </w:rPr>
-        <w:t>Bang 7: Cau hinh bai load test thuc te</w:t>
+        <w:t>Bảng 7: Cấu hình bài load test thực tế</w:t>
       </w:r>
     </w:p>
     <w:tbl>
@@ -4541,7 +4541,7 @@
               <w:rPr>
                 <w:b/>
               </w:rPr>
-              <w:t>Tham so</w:t>
+              <w:t>Tham số</w:t>
             </w:r>
           </w:p>
         </w:tc>
@@ -4560,7 +4560,7 @@
               <w:rPr>
                 <w:b/>
               </w:rPr>
-              <w:t>Gia tri</w:t>
+              <w:t>Giá trị</w:t>
             </w:r>
           </w:p>
         </w:tc>
@@ -4632,7 +4632,7 @@
           </w:tcPr>
           <w:p>
             <w:r>
-              <w:t>13 phut (5 stages)</w:t>
+              <w:t>13 phút (5 stages)</w:t>
             </w:r>
           </w:p>
         </w:tc>
@@ -4764,12 +4764,12 @@
         <w:pStyle w:val="Heading2"/>
       </w:pPr>
       <w:r>
-        <w:t>8.2 Ket Qua Threshold - SLO Da Vi Pham</w:t>
-      </w:r>
-    </w:p>
-    <w:p>
-      <w:r>
-        <w:t>Threshold la cac SLO (Service Level Objective) ban tu dinh nghia trong k6 script. Day la thang do quan trong nhat.</w:t>
+        <w:t>8.2 Kết Quả Threshold - SLO Đã Vi Phạm</w:t>
+      </w:r>
+    </w:p>
+    <w:p>
+      <w:r>
+        <w:t>Threshold là các SLO (Service Level Objective) bạn tự định nghĩa trong k6 script. Đây là thang đo quan trọng nhất.</w:t>
       </w:r>
     </w:p>
     <w:p>
@@ -4778,7 +4778,7 @@
           <w:b/>
           <w:i/>
         </w:rPr>
-        <w:t>Bang 8: Ket qua threshold - 4/5 SLO bi vi pham</w:t>
+        <w:t>Bảng 8: Kết quả threshold - 4/5 SLO bị vi phạm</w:t>
       </w:r>
     </w:p>
     <w:tbl>
@@ -4830,7 +4830,7 @@
               <w:rPr>
                 <w:b/>
               </w:rPr>
-              <w:t>SLO dat ra</w:t>
+              <w:t>SLO đặt ra</w:t>
             </w:r>
           </w:p>
         </w:tc>
@@ -4849,7 +4849,7 @@
               <w:rPr>
                 <w:b/>
               </w:rPr>
-              <w:t>Ket qua thuc te P(95)</w:t>
+              <w:t>Kết quả thực tế P(95)</w:t>
             </w:r>
           </w:p>
         </w:tc>
@@ -4868,7 +4868,7 @@
               <w:rPr>
                 <w:b/>
               </w:rPr>
-              <w:t>Trang thai</w:t>
+              <w:t>Trạng thái</w:t>
             </w:r>
           </w:p>
         </w:tc>
@@ -4887,7 +4887,7 @@
               <w:rPr>
                 <w:b/>
               </w:rPr>
-              <w:t>Vi pham bao nhieu lan</w:t>
+              <w:t>Vi phạm bao nhiêu lần</w:t>
             </w:r>
           </w:p>
         </w:tc>
@@ -4922,7 +4922,7 @@
           </w:tcPr>
           <w:p>
             <w:r>
-              <w:t>38,998ms (39 giay)</w:t>
+              <w:t>38,998ms (39 giây)</w:t>
             </w:r>
           </w:p>
         </w:tc>
@@ -4979,7 +4979,7 @@
           </w:tcPr>
           <w:p>
             <w:r>
-              <w:t>14,946ms (15 giay)</w:t>
+              <w:t>14,946ms (15 giây)</w:t>
             </w:r>
           </w:p>
         </w:tc>
@@ -5036,7 +5036,7 @@
           </w:tcPr>
           <w:p>
             <w:r>
-              <w:t>7,832ms (7.8 giay)</w:t>
+              <w:t>7,832ms (7.8 giây)</w:t>
             </w:r>
           </w:p>
         </w:tc>
@@ -5093,7 +5093,7 @@
           </w:tcPr>
           <w:p>
             <w:r>
-              <w:t>23,130ms (23 giay)</w:t>
+              <w:t>23,130ms (23 giây)</w:t>
             </w:r>
           </w:p>
         </w:tc>
@@ -5133,16 +5133,16 @@
                 <w:b/>
                 <w:color w:val="FF0000"/>
               </w:rPr>
-              <w:t>[CANH BAO] API DUNG VE CHUC NANG (0% error) NHUNG SAI VE HIEU NANG (4/5 threshold fail)</w:t>
-            </w:r>
-          </w:p>
-          <w:p>
-            <w:r>
-              <w:t xml:space="preserve">Dieu nay co nghia: moi request deu tra ve dung status code (200/201/404), khong co 5xx, </w:t>
+              <w:t>[CẢNH BÁO] API ĐÚNG VỀ CHỨC NĂNG (0% error) NHƯNG SAI VỀ HIỆU NĂNG (4/5 threshold fail)</w:t>
+            </w:r>
+          </w:p>
+          <w:p>
+            <w:r>
+              <w:t xml:space="preserve">Điều này có nghĩa: mọi request đều trả về đúng status code (200/201/404), không có 5xx, </w:t>
             </w:r>
             <w:r>
               <w:lastRenderedPageBreak/>
-              <w:t>nhung thoi gian cho qua lon. Trong production, user se abandon request truoc khi nhan duoc response.</w:t>
+              <w:t>nhưng thời gian chờ quá lớn. Trong production, user sẽ abandon request trước khi nhận được response.</w:t>
             </w:r>
           </w:p>
           <w:p>
@@ -5151,7 +5151,7 @@
               <w:outlineLvl w:val="1"/>
             </w:pPr>
             <w:r>
-              <w:t>8.3 Phan Tich Chi Tiet Tung Endpoint</w:t>
+              <w:t>8.3 Phân Tích Chi Tiết Từng Endpoint</w:t>
             </w:r>
           </w:p>
           <w:p>
@@ -5160,12 +5160,12 @@
               <w:outlineLvl w:val="2"/>
             </w:pPr>
             <w:r>
-              <w:t>8.3.1 Login - Bottleneck Nghiem Trong Nhat</w:t>
-            </w:r>
-          </w:p>
-          <w:p>
-            <w:r>
-              <w:t>Day la endpoint cham nhat trong toan bo flow, va cung la diem nghen chinh cua toan he thong.</w:t>
+              <w:t>8.3.1 Login - Bottleneck Nghiêm Trọng Nhất</w:t>
+            </w:r>
+          </w:p>
+          <w:p>
+            <w:r>
+              <w:t>Đây là endpoint chậm nhất trong toàn bộ flow, và cũng là điểm nghẽn chính của toàn hệ thống.</w:t>
             </w:r>
           </w:p>
           <w:p>
@@ -5174,10 +5174,10 @@
                 <w:b/>
                 <w:i/>
               </w:rPr>
-              <w:t xml:space="preserve">Bang 9: login_duration chi </w:t>
-            </w:r>
-            <w:r>
-              <w:t>tiet</w:t>
+              <w:t xml:space="preserve">Bảng 9: login_duration chi </w:t>
+            </w:r>
+            <w:r>
+              <w:t>tiết</w:t>
             </w:r>
           </w:p>
           <w:tbl>
@@ -5227,7 +5227,7 @@
                     <w:rPr>
                       <w:b/>
                     </w:rPr>
-                    <w:t>Gia tri</w:t>
+                    <w:t>Giá trị</w:t>
                   </w:r>
                 </w:p>
               </w:tc>
@@ -5246,7 +5246,7 @@
                     <w:rPr>
                       <w:b/>
                     </w:rPr>
-                    <w:t>Y nghia</w:t>
+                    <w:t>Ý nghĩa</w:t>
                   </w:r>
                 </w:p>
               </w:tc>
@@ -5270,7 +5270,7 @@
                 </w:tcPr>
                 <w:p>
                   <w:r>
-                    <w:t>14,948ms (15 giay)</w:t>
+                    <w:t>14,948ms (15 giây)</w:t>
                   </w:r>
                 </w:p>
               </w:tc>
@@ -5281,7 +5281,7 @@
                 </w:tcPr>
                 <w:p>
                   <w:r>
-                    <w:t>Trung binh 15 giay cho moi login - khong phai outlier</w:t>
+                    <w:t>Trung bình 15 giây cho mỗi login - không phải outlier</w:t>
                   </w:r>
                 </w:p>
               </w:tc>
@@ -5300,7 +5300,7 @@
                 <w:p>
                   <w:r>
                     <w:lastRenderedPageBreak/>
-                    <w:t>Nguyen nhan login cham voi OpenIdDict:</w:t>
+                    <w:t>Nguyên nhân login chậm với OpenIdDict:</w:t>
                   </w:r>
                 </w:p>
                 <w:p>
@@ -5308,7 +5308,7 @@
                     <w:pStyle w:val="ListBullet"/>
                   </w:pPr>
                   <w:r>
-                    <w:t>Moi login can: validate credential (DB r</w:t>
+                    <w:t>Mỗi login cần: validate credential (DB r</w:t>
                   </w:r>
                   <w:r>
                     <w:lastRenderedPageBreak/>
@@ -5324,11 +5324,11 @@
                     <w:pStyle w:val="ListBullet"/>
                   </w:pPr>
                   <w:r>
-                    <w:t xml:space="preserve">1000 VU cung login = 2000 concurrent </w:t>
+                    <w:t xml:space="preserve">1000 VU cùng login = 2000 concurrent </w:t>
                   </w:r>
                   <w:r>
                     <w:lastRenderedPageBreak/>
-                    <w:t>DB writes vao bang OpenIddictTokens</w:t>
+                    <w:t>DB writes vào bảng OpenIddictTokens</w:t>
                   </w:r>
                 </w:p>
                 <w:p>
@@ -5349,11 +5349,11 @@
                   </w:pPr>
                   <w:r>
                     <w:lastRenderedPageBreak/>
-                    <w:t xml:space="preserve">Crypto operation (JWT signing) tuy khong nang nhung cong </w:t>
+                    <w:t xml:space="preserve">Crypto operation (JWT signing) tuy không nặng nhưng cộng </w:t>
                   </w:r>
                   <w:r>
                     <w:lastRenderedPageBreak/>
-                    <w:t>huong voi DB bottleneck</w:t>
+                    <w:t>hưởng với DB bottleneck</w:t>
                   </w:r>
                 </w:p>
                 <w:p>
@@ -5361,11 +5361,11 @@
                     <w:pStyle w:val="ListBullet"/>
                   </w:pPr>
                   <w:r>
-                    <w:t>Bang OpenIddictTokens co the da p</w:t>
+                    <w:t>Bảng OpenIddictTokens có thể đã p</w:t>
                   </w:r>
                   <w:r>
                     <w:lastRenderedPageBreak/>
-                    <w:t>hong to voi hang trieu rows expired chua duoc cleanup</w:t>
+                    <w:t>hồng to với hàng triệu rows expired chưa được cleanup</w:t>
                   </w:r>
                 </w:p>
                 <w:p>
@@ -5384,10 +5384,10 @@
                       <w:b/>
                       <w:i/>
                     </w:rPr>
-                    <w:t xml:space="preserve">Bang 10: product_list_duration chi </w:t>
+                    <w:t xml:space="preserve">Bảng 10: product_list_duration chi </w:t>
                   </w:r>
                   <w:r>
-                    <w:t>tiet</w:t>
+                    <w:t>tiết</w:t>
                   </w:r>
                 </w:p>
                 <w:tbl>
@@ -5437,7 +5437,7 @@
                           <w:rPr>
                             <w:b/>
                           </w:rPr>
-                          <w:t>Gia tri</w:t>
+                          <w:t>Giá trị</w:t>
                         </w:r>
                       </w:p>
                     </w:tc>
@@ -5456,7 +5456,7 @@
                           <w:rPr>
                             <w:b/>
                           </w:rPr>
-                          <w:t>Y nghia</w:t>
+                          <w:t>Ý nghĩa</w:t>
                         </w:r>
                       </w:p>
                     </w:tc>
@@ -5474,23 +5474,23 @@
                       </w:p>
                       <w:p>
                         <w:r>
-                          <w:t xml:space="preserve">Khoang cach </w:t>
+                          <w:t xml:space="preserve">Khoảng cách </w:t>
                         </w:r>
                         <w:r>
                           <w:lastRenderedPageBreak/>
-                          <w:t>lon giua min (5ms) va p(95) (15s) cho thay request duoc xu l</w:t>
+                          <w:t>lớn giữa min (5ms) và p(95) (15s) cho thấy request được xử l</w:t>
                         </w:r>
                         <w:r>
                           <w:lastRenderedPageBreak/>
-                          <w:t>y nhanh khi server ranh, nhung phai doi rat lau khi server b</w:t>
+                          <w:t>ý nhanh khi server rảnh, nhưng phải đợi rất lâu khi server b</w:t>
                         </w:r>
                         <w:r>
                           <w:lastRenderedPageBreak/>
-                          <w:t>i nghen. Day la queue waiting pattern - van de la thread/con</w:t>
+                          <w:t>ị nghẽn. Đây là queue waiting pattern - vấn đề là thread/con</w:t>
                         </w:r>
                         <w:r>
                           <w:lastRenderedPageBreak/>
-                          <w:t>nection pool, khong phai ban than query.</w:t>
+                          <w:t>nection pool, không phải bản thân query.</w:t>
                         </w:r>
                       </w:p>
                       <w:p>
@@ -5509,7 +5509,7 @@
                             <w:b/>
                             <w:i/>
                           </w:rPr>
-                          <w:t>Bang 11: cre</w:t>
+                          <w:t>Bảng 11: cre</w:t>
                         </w:r>
                         <w:r>
                           <w:rPr>
@@ -5517,7 +5517,7 @@
                             <w:i/>
                           </w:rPr>
                           <w:lastRenderedPageBreak/>
-                          <w:t>ate_order_duration - chu y khoang cach lon giua med va p(9</w:t>
+                          <w:t>ate_order_duration - chú ý khoảng cách lớn giữa med và p(9</w:t>
                         </w:r>
                         <w:r>
                           <w:rPr>
@@ -5575,7 +5575,7 @@
                                 <w:rPr>
                                   <w:b/>
                                 </w:rPr>
-                                <w:t>Gia tri</w:t>
+                                <w:t>Giá trị</w:t>
                               </w:r>
                             </w:p>
                           </w:tc>
@@ -5594,7 +5594,7 @@
                                 <w:rPr>
                                   <w:b/>
                                 </w:rPr>
-                                <w:t>Y nghia</w:t>
+                                <w:t>Ý nghĩa</w:t>
                               </w:r>
                             </w:p>
                           </w:tc>
@@ -5629,7 +5629,7 @@
                             </w:tcPr>
                             <w:p>
                               <w:r>
-                                <w:t>Trung binh 1.6 giay</w:t>
+                                <w:t>Trung bình 1.6 giây</w:t>
                               </w:r>
                             </w:p>
                           </w:tc>
@@ -5651,7 +5651,7 @@
                               </w:r>
                               <w:r>
                                 <w:lastRenderedPageBreak/>
-                                <w:t>n = 190ms nhung p(95) = 7832ms la 2 nhom rieng biet:</w:t>
+                                <w:t>n = 190ms nhưng p(95) = 7832ms là 2 nhóm riêng biệt:</w:t>
                               </w:r>
                             </w:p>
                             <w:p>
@@ -5659,15 +5659,15 @@
                                 <w:pStyle w:val="ListBullet"/>
                               </w:pPr>
                               <w:r>
-                                <w:t>Nhom 1 (ph</w:t>
+                                <w:t>Nhóm 1 (ph</w:t>
                               </w:r>
                               <w:r>
                                 <w:lastRenderedPageBreak/>
-                                <w:t>áº§n lá»›n): Order tao nhanh khi co thread va DB connecti</w:t>
+                                <w:t>ần lớn): Order tạo nhanh khi có thread và DB connection sẵ</w:t>
                               </w:r>
                               <w:r>
                                 <w:lastRenderedPageBreak/>
-                                <w:t>on san sang</w:t>
+                                <w:t>n sàng</w:t>
                               </w:r>
                             </w:p>
                             <w:p>
@@ -5675,11 +5675,11 @@
                                 <w:pStyle w:val="ListBullet"/>
                               </w:pPr>
                               <w:r>
-                                <w:t>Nhom 2 (5-10%): Order phai cho lau khi DB dang b</w:t>
+                                <w:t>Nhóm 2 (5-10%): Order phải chờ lâu khi DB đang bị loc</w:t>
                               </w:r>
                               <w:r>
                                 <w:lastRenderedPageBreak/>
-                                <w:t>i lock hoac connection pool day</w:t>
+                                <w:t>k hoặc connection pool đầy</w:t>
                               </w:r>
                             </w:p>
                             <w:p>
@@ -5687,15 +5687,15 @@
                                 <w:pStyle w:val="ListBullet"/>
                               </w:pPr>
                               <w:r>
-                                <w:t xml:space="preserve">Nguyen nhan: concurrent </w:t>
+                                <w:t>Nguyên nhân: concurrent writ</w:t>
                               </w:r>
                               <w:r>
                                 <w:lastRenderedPageBreak/>
-                                <w:t>writes vao orders table + co the co row-level lock khi che</w:t>
+                                <w:t>es vào orders table + có thể có row-level lock khi check in</w:t>
                               </w:r>
                               <w:r>
                                 <w:lastRenderedPageBreak/>
-                                <w:t>ck inventory</w:t>
+                                <w:t>ventory</w:t>
                               </w:r>
                             </w:p>
                             <w:p>
@@ -5704,7 +5704,7 @@
                                 <w:outlineLvl w:val="1"/>
                               </w:pPr>
                               <w:r>
-                                <w:t>8.4 HTTP Metrics Tong Hop</w:t>
+                                <w:t>8.4 HTTP Metrics Tổng Hợp</w:t>
                               </w:r>
                             </w:p>
                             <w:p>
@@ -5713,7 +5713,7 @@
                                   <w:b/>
                                   <w:i/>
                                 </w:rPr>
-                                <w:t xml:space="preserve">Bang 12: HTTP </w:t>
+                                <w:t>Bảng 12: HTTP metri</w:t>
                               </w:r>
                               <w:r>
                                 <w:rPr>
@@ -5721,10 +5721,10 @@
                                   <w:i/>
                                 </w:rPr>
                                 <w:lastRenderedPageBreak/>
-                                <w:t xml:space="preserve">metrics tong </w:t>
+                                <w:t xml:space="preserve">cs tổng </w:t>
                               </w:r>
                               <w:r>
-                                <w:t>hop</w:t>
+                                <w:t>hợp</w:t>
                               </w:r>
                             </w:p>
                             <w:tbl>
@@ -5774,7 +5774,7 @@
                                       <w:rPr>
                                         <w:b/>
                                       </w:rPr>
-                                      <w:t>Gia tri</w:t>
+                                      <w:t>Giá trị</w:t>
                                     </w:r>
                                   </w:p>
                                 </w:tc>
@@ -5793,7 +5793,7 @@
                                       <w:rPr>
                                         <w:b/>
                                       </w:rPr>
-                                      <w:t>Nhan xet</w:t>
+                                      <w:t>Nhận xét</w:t>
                                     </w:r>
                                   </w:p>
                                 </w:tc>
@@ -5815,7 +5815,7 @@
                                         <w:b/>
                                         <w:color w:val="0000FF"/>
                                       </w:rPr>
-                                      <w:t>[INFO] THROUGHPUT THUC TE: 57.</w:t>
+                                      <w:t>[INFO] THROUGHPUT THỰC TẾ: 57.8 req</w:t>
                                     </w:r>
                                     <w:r>
                                       <w:rPr>
@@ -5823,7 +5823,7 @@
                                         <w:color w:val="0000FF"/>
                                       </w:rPr>
                                       <w:lastRenderedPageBreak/>
-                                      <w:t xml:space="preserve">8 req/s voi 1000 VU. Neu tinh theo breaking point (200-300 </w:t>
+                                      <w:t>/s với 1000 VU. Nếu tính theo breaking point (200-300 VU), h</w:t>
                                     </w:r>
                                     <w:r>
                                       <w:rPr>
@@ -5831,7 +5831,7 @@
                                         <w:color w:val="0000FF"/>
                                       </w:rPr>
                                       <w:lastRenderedPageBreak/>
-                                      <w:t>VU), he thong chi co the xu ly ~200 req/s mot cach on dinh.</w:t>
+                                      <w:t>ệ thống chỉ có thể xử lý ~200 req/s một cách ổn định.</w:t>
                                     </w:r>
                                   </w:p>
                                   <w:p>
@@ -5841,7 +5841,7 @@
                                     </w:pPr>
                                     <w:r>
                                       <w:lastRenderedPageBreak/>
-                                      <w:t>8.5 Execution Metrics - Hanh Vi User Journey</w:t>
+                                      <w:t>8.5 Execution Metrics - Hành Vi User Journey</w:t>
                                     </w:r>
                                   </w:p>
                                   <w:p>
@@ -5850,7 +5850,7 @@
                                         <w:b/>
                                         <w:i/>
                                       </w:rPr>
-                                      <w:t>Bang 1</w:t>
+                                      <w:t>Bảng 1</w:t>
                                     </w:r>
                                     <w:r>
                                       <w:rPr>
@@ -5911,7 +5911,7 @@
                                             <w:rPr>
                                               <w:b/>
                                             </w:rPr>
-                                            <w:t>Gia tri</w:t>
+                                            <w:t>Giá trị</w:t>
                                           </w:r>
                                         </w:p>
                                       </w:tc>
@@ -5930,7 +5930,7 @@
                                             <w:rPr>
                                               <w:b/>
                                             </w:rPr>
-                                            <w:t>Y nghia</w:t>
+                                            <w:t>Ý nghĩa</w:t>
                                           </w:r>
                                         </w:p>
                                       </w:tc>
@@ -5952,15 +5952,15 @@
                                           </w:r>
                                           <w:r>
                                             <w:lastRenderedPageBreak/>
-                                            <w:t>ons: day khong phai loi - la 296 VU dang o giua flow (vi du dan</w:t>
+                                            <w:t>ons: đây không phải lỗi - là 296 VU đang ở giữa flow (ví dụ đan</w:t>
                                           </w:r>
                                           <w:r>
                                             <w:lastRenderedPageBreak/>
-                                            <w:t xml:space="preserve">g cho login response) khi test timeout. Neu muon giam con so </w:t>
+                                            <w:t xml:space="preserve">g chờ login response) khi test timeout. Nếu muốn giảm con số </w:t>
                                           </w:r>
                                           <w:r>
                                             <w:lastRenderedPageBreak/>
-                                            <w:t>nay, tang gracefulStop len 60s.</w:t>
+                                            <w:t>này, tăng gracefulStop lên 60s.</w:t>
                                           </w:r>
                                         </w:p>
                                         <w:p>
@@ -5970,7 +5970,7 @@
                                           </w:pPr>
                                           <w:r>
                                             <w:lastRenderedPageBreak/>
-                                            <w:t>8.6 Chan Doan Root Cause</w:t>
+                                            <w:t>8.6 Chẩn Đoán Root Cause</w:t>
                                           </w:r>
                                         </w:p>
                                         <w:p>
@@ -5979,7 +5979,7 @@
                                               <w:b/>
                                               <w:color w:val="FF0000"/>
                                             </w:rPr>
-                                            <w:t>[CANH BAO] CHAN DOAN: SQL Ser</w:t>
+                                            <w:t>[CẢNH BÁO] CHẨN ĐOÁN: SQL Ser</w:t>
                                           </w:r>
                                           <w:r>
                                             <w:rPr>
@@ -5987,7 +5987,7 @@
                                               <w:color w:val="FF0000"/>
                                             </w:rPr>
                                             <w:lastRenderedPageBreak/>
-                                            <w:t>ver la single point of failure - DB write contention o tang Ope</w:t>
+                                            <w:t>ver là single point of failure - DB write contention ở tầng Ope</w:t>
                                           </w:r>
                                           <w:r>
                                             <w:rPr>
@@ -6003,7 +6003,7 @@
                                         </w:p>
                                         <w:p>
                                           <w:r>
-                                            <w:t>Chuoi su kien da xay ra trong bai test:</w:t>
+                                            <w:t>Chuỗi sự kiện đã xảy ra trong bài test:</w:t>
                                           </w:r>
                                         </w:p>
                                         <w:p>
@@ -6015,7 +6015,7 @@
                                           </w:r>
                                           <w:r>
                                             <w:lastRenderedPageBreak/>
-                                            <w:t>e 1 (0-300 VU): He thong con xu ly duoc, login mat ~200-500</w:t>
+                                            <w:t>e 1 (0-300 VU): Hệ thống còn xử lý được, login mất ~200-500</w:t>
                                           </w:r>
                                           <w:r>
                                             <w:lastRenderedPageBreak/>
@@ -6027,11 +6027,11 @@
                                             <w:pStyle w:val="ListBullet"/>
                                           </w:pPr>
                                           <w:r>
-                                            <w:t>Stage 2 (300-600 VU): DB connection pool bat dau sat ng</w:t>
+                                            <w:t>Stage 2 (300-600 VU): DB connection pool bắt đầu sát ng</w:t>
                                           </w:r>
                                           <w:r>
                                             <w:lastRenderedPageBreak/>
-                                            <w:t>uong, login tang len 5-10s</w:t>
+                                            <w:t>ưỡng, login tăng lên 5-10s</w:t>
                                           </w:r>
                                         </w:p>
                                         <w:p>
@@ -6043,7 +6043,7 @@
                                           </w:r>
                                           <w:r>
                                             <w:lastRenderedPageBreak/>
-                                            <w:t>hausted, request xep hang, login = 14-39s</w:t>
+                                            <w:t>hausted, request xếp hàng, login = 14-39s</w:t>
                                           </w:r>
                                         </w:p>
                                         <w:p>
@@ -6055,11 +6055,11 @@
                                           </w:r>
                                           <w:r>
                                             <w:lastRenderedPageBreak/>
-                                            <w:t>U maintain): He thong nghen hoan toan, iteration = 31s tr</w:t>
+                                            <w:t>U maintain): Hệ thống nghẽn hoàn toàn, iteration = 31s tr</w:t>
                                           </w:r>
                                           <w:r>
                                             <w:lastRenderedPageBreak/>
-                                            <w:t>ung binh</w:t>
+                                            <w:t>ung bình</w:t>
                                           </w:r>
                                         </w:p>
                                         <w:p>
@@ -6067,7 +6067,7 @@
                                             <w:pStyle w:val="ListBullet"/>
                                           </w:pPr>
                                           <w:r>
-                                            <w:t>Stage 5 (ramp down): P95 giam dan khi VU giam</w:t>
+                                            <w:t>Stage 5 (ramp down): P95 giảm dần khi VU giảm</w:t>
                                           </w:r>
                                         </w:p>
                                         <w:p>
@@ -6076,7 +6076,7 @@
                                           </w:r>
                                           <w:r>
                                             <w:lastRenderedPageBreak/>
-                                            <w:t>ky thuat chi tiet:</w:t>
+                                            <w:t>kỹ thuật chi tiết:</w:t>
                                           </w:r>
                                         </w:p>
                                         <w:p>
@@ -6091,13 +6091,13 @@
                                               <w:color w:val="000080"/>
                                               <w:sz w:val="18"/>
                                             </w:rPr>
-                                            <w:t xml:space="preserve">1000 VU login dong </w:t>
-                                          </w:r>
-                                          <w:r>
-                                            <w:rPr>
-                                              <w:rFonts w:ascii="Calibri" w:hAnsi="Calibri" w:cs="Calibri"/>
-                                            </w:rPr>
-                                            <w:t>thoi</w:t>
+                                            <w:t xml:space="preserve">1000 VU login đồng </w:t>
+                                          </w:r>
+                                          <w:r>
+                                            <w:rPr>
+                                              <w:rFonts w:ascii="Calibri" w:hAnsi="Calibri" w:cs="Calibri"/>
+                                            </w:rPr>
+                                            <w:t>thời</w:t>
                                           </w:r>
                                         </w:p>
                                         <w:p>
@@ -6217,7 +6217,7 @@
                                               <w:sz w:val="18"/>
                                             </w:rPr>
                                             <w:lastRenderedPageBreak/>
-                                            <w:t xml:space="preserve">urrent writes -&gt; bang OpenIddictTokens lock </w:t>
+                                            <w:t xml:space="preserve">urrent writes -&gt; bảng OpenIddictTokens lock </w:t>
                                           </w:r>
                                           <w:r>
                                             <w:rPr>
@@ -6283,7 +6283,7 @@
                                               <w:sz w:val="18"/>
                                             </w:rPr>
                                             <w:lastRenderedPageBreak/>
-                                            <w:t>on pool (max 100 mac dinh) -&gt; 900 threads block-</w:t>
+                                            <w:t>on pool (max 100 mặc định) -&gt; 900 threads block-</w:t>
                                           </w:r>
                                           <w:r>
                                             <w:rPr>
@@ -6349,7 +6349,7 @@
                                               <w:sz w:val="18"/>
                                             </w:rPr>
                                             <w:lastRenderedPageBreak/>
-                                            <w:t xml:space="preserve">ap thread de block-wait -&gt; pool </w:t>
+                                            <w:t xml:space="preserve">ấp thread để block-wait -&gt; pool </w:t>
                                           </w:r>
                                           <w:r>
                                             <w:rPr>
@@ -6406,7 +6406,7 @@
                                               <w:color w:val="000080"/>
                                               <w:sz w:val="18"/>
                                             </w:rPr>
-                                            <w:t xml:space="preserve">Request moi xep hang -&gt; P95 </w:t>
+                                            <w:t xml:space="preserve">Request mới xếp hàng -&gt; P95 </w:t>
                                           </w:r>
                                           <w:r>
                                             <w:rPr>
@@ -6441,7 +6441,7 @@
                                               <w:sz w:val="22"/>
                                             </w:rPr>
                                             <w:lastRenderedPageBreak/>
-                                            <w:t>8.7 Ke Hoach Xu Ly Theo Thu Tu Uu Tien</w:t>
+                                            <w:t>8.7 Kế Hoạch Xử Lý Theo Thứ Tự Ưu Tiên</w:t>
                                           </w:r>
                                         </w:p>
                                         <w:p>
@@ -6460,7 +6460,7 @@
                                               <w:color w:val="auto"/>
                                               <w:sz w:val="22"/>
                                             </w:rPr>
-                                            <w:t>Uu Tien 1: Tang Connec</w:t>
+                                            <w:t>Ưu Tiên 1: Tăng Connec</w:t>
                                           </w:r>
                                           <w:r>
                                             <w:rPr>
@@ -6469,7 +6469,7 @@
                                               <w:sz w:val="22"/>
                                             </w:rPr>
                                             <w:lastRenderedPageBreak/>
-                                            <w:t>tion Pool Size (quick win, 5 phut)</w:t>
+                                            <w:t>tion Pool Size (quick win, 5 phút)</w:t>
                                           </w:r>
                                         </w:p>
                                         <w:p>
@@ -6482,14 +6482,14 @@
                                             <w:rPr>
                                               <w:rFonts w:ascii="Calibri" w:hAnsi="Calibri" w:cs="Calibri"/>
                                             </w:rPr>
-                                            <w:t xml:space="preserve">Hien tai connection pool mac </w:t>
+                                            <w:t xml:space="preserve">Hiện tại connection pool mặc </w:t>
                                           </w:r>
                                           <w:r>
                                             <w:rPr>
                                               <w:rFonts w:ascii="Calibri" w:hAnsi="Calibri" w:cs="Calibri"/>
                                             </w:rPr>
                                             <w:lastRenderedPageBreak/>
-                                            <w:t>dinh = 100 connections. 1000 VU can it nhat 200-300 connectio</w:t>
+                                            <w:t>định = 100 connections. 1000 VU cần ít nhất 200-300 connectio</w:t>
                                           </w:r>
                                           <w:r>
                                             <w:rPr>
@@ -6511,7 +6511,7 @@
                                               <w:color w:val="000080"/>
                                               <w:sz w:val="18"/>
                                             </w:rPr>
-                                            <w:t>// appsettings.json hoac environment variable:</w:t>
+                                            <w:t>// appsettings.json hoặc environment variable:</w:t>
                                           </w:r>
                                         </w:p>
                                         <w:p>
@@ -6587,14 +6587,14 @@
                                             <w:rPr>
                                               <w:rFonts w:ascii="Calibri" w:hAnsi="Calibri" w:cs="Calibri"/>
                                             </w:rPr>
-                                            <w:t>Ket qua ky vong: login p</w:t>
+                                            <w:t>Kết quả kỳ vọng: login p</w:t>
                                           </w:r>
                                           <w:r>
                                             <w:rPr>
                                               <w:rFonts w:ascii="Calibri" w:hAnsi="Calibri" w:cs="Calibri"/>
                                             </w:rPr>
                                             <w:lastRenderedPageBreak/>
-                                            <w:t>(95) giam tu 39s xuong 5-10s. Khong can code change, chi co</w:t>
+                                            <w:t>(95) giảm từ 39s xuống 5-10s. Không cần code change, chỉ co</w:t>
                                           </w:r>
                                           <w:r>
                                             <w:rPr>
@@ -6616,7 +6616,7 @@
                                             <w:rPr>
                                               <w:rFonts w:ascii="Calibri" w:hAnsi="Calibri" w:cs="Calibri"/>
                                             </w:rPr>
-                                            <w:t>Uu Tien 2: OpenIdDict Token Cleanup (1-2 gio)</w:t>
+                                            <w:t>Ưu Tiên 2: OpenIdDict Token Cleanup (1-2 giờ)</w:t>
                                           </w:r>
                                         </w:p>
                                         <w:p>
@@ -6629,21 +6629,21 @@
                                             <w:rPr>
                                               <w:rFonts w:ascii="Calibri" w:hAnsi="Calibri" w:cs="Calibri"/>
                                             </w:rPr>
-                                            <w:t>Ba</w:t>
+                                            <w:t>Bả</w:t>
                                           </w:r>
                                           <w:r>
                                             <w:rPr>
                                               <w:rFonts w:ascii="Calibri" w:hAnsi="Calibri" w:cs="Calibri"/>
                                             </w:rPr>
                                             <w:lastRenderedPageBreak/>
-                                            <w:t xml:space="preserve">ng OpenIddictTokens co the da chua hang trieu rows expired, </w:t>
+                                            <w:t xml:space="preserve">ng OpenIddictTokens có thể đã chứa hàng triệu rows expired, </w:t>
                                           </w:r>
                                           <w:r>
                                             <w:rPr>
                                               <w:rFonts w:ascii="Calibri" w:hAnsi="Calibri" w:cs="Calibri"/>
                                             </w:rPr>
                                             <w:lastRenderedPageBreak/>
-                                            <w:t>lam query/insert cham.</w:t>
+                                            <w:t>làm query/insert chậm.</w:t>
                                           </w:r>
                                         </w:p>
                                         <w:p>
@@ -6658,7 +6658,7 @@
                                               <w:color w:val="000080"/>
                                               <w:sz w:val="18"/>
                                             </w:rPr>
-                                            <w:t>-- Kiem tra so luong token expired:</w:t>
+                                            <w:t>-- Kiểm tra số lượng token expired:</w:t>
                                           </w:r>
                                         </w:p>
                                         <w:p>
@@ -6713,7 +6713,7 @@
                                               <w:sz w:val="18"/>
                                             </w:rPr>
                                             <w:lastRenderedPageBreak/>
-                                            <w:t>iem tra size bang:</w:t>
+                                            <w:t>iểm tra size bảng:</w:t>
                                           </w:r>
                                         </w:p>
                                         <w:p>
@@ -7058,7 +7058,7 @@
                                             <w:rPr>
                                               <w:rFonts w:ascii="Calibri" w:hAnsi="Calibri" w:cs="Calibri"/>
                                             </w:rPr>
-                                            <w:t>Hoac bat OpenIdDict backg</w:t>
+                                            <w:t>Hoặc bật OpenIdDict backg</w:t>
                                           </w:r>
                                           <w:r>
                                             <w:rPr>
@@ -7311,7 +7311,7 @@
                                               <w:color w:val="000080"/>
                                               <w:sz w:val="18"/>
                                             </w:rPr>
-                                            <w:t>// Them hosted s</w:t>
+                                            <w:t>// Thêm hosted s</w:t>
                                           </w:r>
                                           <w:r>
                                             <w:rPr>
@@ -7320,7 +7320,7 @@
                                               <w:sz w:val="18"/>
                                             </w:rPr>
                                             <w:lastRenderedPageBreak/>
-                                            <w:t>ervice de tu dong cleanup:</w:t>
+                                            <w:t>ervice để tự động cleanup:</w:t>
                                           </w:r>
                                         </w:p>
                                         <w:p>
@@ -7359,7 +7359,7 @@
                                               <w:color w:val="000080"/>
                                               <w:sz w:val="18"/>
                                             </w:rPr>
-                                            <w:t>// OpenIddictTokenCleanupService la bu</w:t>
+                                            <w:t>// OpenIddictTokenCleanupService là bu</w:t>
                                           </w:r>
                                           <w:r>
                                             <w:rPr>
@@ -7394,7 +7394,7 @@
                                               <w:sz w:val="22"/>
                                             </w:rPr>
                                             <w:lastRenderedPageBreak/>
-                                            <w:t>Uu Tien 3: Kiem Tra va Them Index (2-4 gio)</w:t>
+                                            <w:t>Ưu Tiên 3: Kiểm Tra và Thêm Index (2-4 giờ)</w:t>
                                           </w:r>
                                         </w:p>
                                         <w:p>
@@ -7414,14 +7414,14 @@
                                               <w:rFonts w:ascii="Calibri" w:hAnsi="Calibri" w:cs="Calibri"/>
                                             </w:rPr>
                                             <w:lastRenderedPageBreak/>
-                                            <w:t>ction pool, chay lai test va xem query nao van cham, them ind</w:t>
+                                            <w:t>ction pool, chạy lại test và xem query nào vẫn chậm, thêm ind</w:t>
                                           </w:r>
                                           <w:r>
                                             <w:rPr>
                                               <w:rFonts w:ascii="Calibri" w:hAnsi="Calibri" w:cs="Calibri"/>
                                             </w:rPr>
                                             <w:lastRenderedPageBreak/>
-                                            <w:t>ex neu can.</w:t>
+                                            <w:t>ex nếu cần.</w:t>
                                           </w:r>
                                         </w:p>
                                         <w:p>
@@ -7655,7 +7655,7 @@
                                               <w:sz w:val="22"/>
                                             </w:rPr>
                                             <w:lastRenderedPageBreak/>
-                                            <w:t>Uu Tien 4: Async Code Review (4-8 gio)</w:t>
+                                            <w:t>Ưu Tiên 4: Async Code Review (4-8 giờ)</w:t>
                                           </w:r>
                                         </w:p>
                                         <w:p>
@@ -7668,14 +7668,14 @@
                                             <w:rPr>
                                               <w:rFonts w:ascii="Calibri" w:hAnsi="Calibri" w:cs="Calibri"/>
                                             </w:rPr>
-                                            <w:t>Kiem tra toan bo cod</w:t>
+                                            <w:t>Kiểm tra toàn bộ cod</w:t>
                                           </w:r>
                                           <w:r>
                                             <w:rPr>
                                               <w:rFonts w:ascii="Calibri" w:hAnsi="Calibri" w:cs="Calibri"/>
                                             </w:rPr>
                                             <w:lastRenderedPageBreak/>
-                                            <w:t>e EF Core co dung async khong:</w:t>
+                                            <w:t>e EF Core có dùng async không:</w:t>
                                           </w:r>
                                         </w:p>
                                         <w:p>
@@ -7760,7 +7760,7 @@
                                               <w:color w:val="000080"/>
                                               <w:sz w:val="18"/>
                                             </w:rPr>
-                                            <w:t>// GOOD - async, khong bl</w:t>
+                                            <w:t>// GOOD - async, không bl</w:t>
                                           </w:r>
                                           <w:r>
                                             <w:rPr>
@@ -7839,7 +7839,7 @@
                                               <w:color w:val="000080"/>
                                               <w:sz w:val="18"/>
                                             </w:rPr>
-                                            <w:t>// Tim nhanh trong codebase:</w:t>
+                                            <w:t>// Tìm nhanh trong codebase:</w:t>
                                           </w:r>
                                         </w:p>
                                         <w:p>
@@ -7879,7 +7879,7 @@
                                               <w:rFonts w:ascii="Calibri" w:hAnsi="Calibri" w:cs="Calibri"/>
                                             </w:rPr>
                                             <w:lastRenderedPageBreak/>
-                                            <w:t>Uu Tien 5: Load Test Lai De Xac Nhan Fix</w:t>
+                                            <w:t>Ưu Tiên 5: Load Test Lại Để Xác Nhận Fix</w:t>
                                           </w:r>
                                         </w:p>
                                         <w:p>
@@ -7892,14 +7892,14 @@
                                             <w:rPr>
                                               <w:rFonts w:ascii="Calibri" w:hAnsi="Calibri" w:cs="Calibri"/>
                                             </w:rPr>
-                                            <w:t xml:space="preserve">Sau moi fix, chay </w:t>
+                                            <w:t xml:space="preserve">Sau mỗi fix, chạy </w:t>
                                           </w:r>
                                           <w:r>
                                             <w:rPr>
                                               <w:rFonts w:ascii="Calibri" w:hAnsi="Calibri" w:cs="Calibri"/>
                                             </w:rPr>
                                             <w:lastRenderedPageBreak/>
-                                            <w:t>lai load test de verify:</w:t>
+                                            <w:t>lại load test để verify:</w:t>
                                           </w:r>
                                         </w:p>
                                         <w:p>
@@ -7910,14 +7910,14 @@
                                             <w:rPr>
                                               <w:rFonts w:ascii="Calibri" w:hAnsi="Calibri" w:cs="Calibri"/>
                                             </w:rPr>
-                                            <w:t>login p(95) phai xuong duoi 2000m</w:t>
+                                            <w:t>login p(95) phải xuống dưới 2000m</w:t>
                                           </w:r>
                                           <w:r>
                                             <w:rPr>
                                               <w:rFonts w:ascii="Calibri" w:hAnsi="Calibri" w:cs="Calibri"/>
                                             </w:rPr>
                                             <w:lastRenderedPageBreak/>
-                                            <w:t>s voi 300-400 VU</w:t>
+                                            <w:t>s với 300-400 VU</w:t>
                                           </w:r>
                                         </w:p>
                                         <w:p>
@@ -7928,14 +7928,14 @@
                                             <w:rPr>
                                               <w:rFonts w:ascii="Calibri" w:hAnsi="Calibri" w:cs="Calibri"/>
                                             </w:rPr>
-                                            <w:t>Thread count trong Grafana phai on dinh (</w:t>
+                                            <w:t>Thread count trong Grafana phải ổn định (</w:t>
                                           </w:r>
                                           <w:r>
                                             <w:rPr>
                                               <w:rFonts w:ascii="Calibri" w:hAnsi="Calibri" w:cs="Calibri"/>
                                             </w:rPr>
                                             <w:lastRenderedPageBreak/>
-                                            <w:t>khong tang theo VU)</w:t>
+                                            <w:t>không tăng theo VU)</w:t>
                                           </w:r>
                                         </w:p>
                                         <w:p>
@@ -7946,14 +7946,14 @@
                                             <w:rPr>
                                               <w:rFonts w:ascii="Calibri" w:hAnsi="Calibri" w:cs="Calibri"/>
                                             </w:rPr>
-                                            <w:t>Breaking point phai di len it nhat 2x s</w:t>
+                                            <w:t>Breaking point phải đi lên ít nhất 2x s</w:t>
                                           </w:r>
                                           <w:r>
                                             <w:rPr>
                                               <w:rFonts w:ascii="Calibri" w:hAnsi="Calibri" w:cs="Calibri"/>
                                             </w:rPr>
                                             <w:lastRenderedPageBreak/>
-                                            <w:t>o voi truoc</w:t>
+                                            <w:t>o với trước</w:t>
                                           </w:r>
                                         </w:p>
                                         <w:p>
@@ -7968,7 +7968,7 @@
                                             <w:rPr>
                                               <w:rFonts w:ascii="Calibri" w:hAnsi="Calibri" w:cs="Calibri"/>
                                             </w:rPr>
-                                            <w:t>8.8 So Sanh Truoc Va Sau Fix (Ky Vong)</w:t>
+                                            <w:t>8.8 So Sánh Trước Và Sau Fix (Kỳ Vọng)</w:t>
                                           </w:r>
                                         </w:p>
                                         <w:p>
@@ -7983,7 +7983,7 @@
                                               <w:b/>
                                               <w:i/>
                                             </w:rPr>
-                                            <w:t>Ban</w:t>
+                                            <w:t>Bản</w:t>
                                           </w:r>
                                           <w:r>
                                             <w:rPr>
@@ -7992,7 +7992,7 @@
                                               <w:i/>
                                             </w:rPr>
                                             <w:lastRenderedPageBreak/>
-                                            <w:t>g 14: So sanh ket qua truoc va sau fix (du kien)</w:t>
+                                            <w:t>g 14: So sánh kết quả trước và sau fix (dự kiến)</w:t>
                                           </w:r>
                                         </w:p>
                                         <w:tbl>
@@ -8034,12 +8034,12 @@
                                                   <w:outlineLvl w:val="1"/>
                                                 </w:pPr>
                                                 <w:r>
-                                                  <w:t>8.9 Bai Hoc Tong Ket Tu Case Study Nay</w:t>
+                                                  <w:t>8.9 Bài Học Tổng Kết Từ Case Study Này</w:t>
                                                 </w:r>
                                               </w:p>
                                               <w:p>
                                                 <w:r>
-                                                  <w:t>Day la nhung bai hoc quan trong Technical Leader can nho:</w:t>
+                                                  <w:t>Đây là những bài học quan trọng Technical Leader cần nhớ:</w:t>
                                                 </w:r>
                                               </w:p>
                                               <w:p>
@@ -8047,7 +8047,7 @@
                                                   <w:pStyle w:val="ListBullet"/>
                                                 </w:pPr>
                                                 <w:r>
-                                                  <w:t>Checks pass 100% + Threshold fail = API dung nhung chua du toc do - can phan biet 2 loai nay</w:t>
+                                                  <w:t>Checks pass 100% + Threshold fail = API đúng nhưng chưa đủ tốc độ - cần phân biệt 2 loại này</w:t>
                                                 </w:r>
                                               </w:p>
                                               <w:p>
@@ -8055,7 +8055,7 @@
                                                   <w:pStyle w:val="ListBullet"/>
                                                 </w:pPr>
                                                 <w:r>
-                                                  <w:t>P(95) quan trong hon Average vi no phan anh user thuc te cham nhat van duoc phuc vu</w:t>
+                                                  <w:t>P(95) quan trọng hơn Average vì nó phản ánh user thực tế chậm nhất vẫn được phục vụ</w:t>
                                                 </w:r>
                                               </w:p>
                                               <w:p>
@@ -8063,7 +8063,7 @@
                                                   <w:pStyle w:val="ListBullet"/>
                                                 </w:pPr>
                                                 <w:r>
-                                                  <w:t>Bimodal distribution (med thap, p95 cao) = queue waiting pattern, khong phai query cham</w:t>
+                                                  <w:t>Bimodal distribution (med thấp, p95 cao) = queue waiting pattern, không phải query chậm</w:t>
                                                 </w:r>
                                               </w:p>
                                               <w:p>
@@ -8071,7 +8071,7 @@
                                                   <w:pStyle w:val="ListBullet"/>
                                                 </w:pPr>
                                                 <w:r>
-                                                  <w:t>Login la critical path: neu login cham, toan bo user journey cham</w:t>
+                                                  <w:t>Login là critical path: nếu login chậm, toàn bộ user journey chậm</w:t>
                                                 </w:r>
                                               </w:p>
                                               <w:p>
@@ -8079,7 +8079,7 @@
                                                   <w:pStyle w:val="ListBullet"/>
                                                 </w:pPr>
                                                 <w:r>
-                                                  <w:t>OpenIdDict can duoc cau hinh cleanup de tranh bang tokens phong to</w:t>
+                                                  <w:t>OpenIdDict cần được cấu hình cleanup để tránh bảng tokens phồng to</w:t>
                                                 </w:r>
                                               </w:p>
                                               <w:p>
@@ -8087,7 +8087,7 @@
                                                   <w:pStyle w:val="ListBullet"/>
                                                 </w:pPr>
                                                 <w:r>
-                                                  <w:t>Connection pool size phai duoc tang truoc khi go production voi nhieu concurrent user</w:t>
+                                                  <w:t>Connection pool size phải được tăng trước khi go production với nhiều concurrent user</w:t>
                                                 </w:r>
                                               </w:p>
                                               <w:p>
@@ -8095,7 +8095,7 @@
                                                   <w:pStyle w:val="ListBullet"/>
                                                 </w:pPr>
                                                 <w:r>
-                                                  <w:t>Breaking point phai duoc xac dinh truoc khi deploy: chay stress test ngay tu dau sprint</w:t>
+                                                  <w:t>Breaking point phải được xác định trước khi deploy: chạy stress test ngay từ đầu sprint</w:t>
                                                 </w:r>
                                               </w:p>
                                               <w:p>
@@ -8103,7 +8103,7 @@
                                                   <w:pStyle w:val="ListBullet"/>
                                                 </w:pPr>
                                                 <w:r>
-                                                  <w:t>Luon chay load test voi BASE_URL tro vao staging, khong chay tren production</w:t>
+                                                  <w:t>Luôn chạy load test với BASE_URL trỏ vào staging, không chạy trên production</w:t>
                                                 </w:r>
                                               </w:p>
                                               <w:p>
@@ -8112,7 +8112,7 @@
                                                     <w:b/>
                                                     <w:color w:val="008000"/>
                                                   </w:rPr>
-                                                  <w:t>[OK] NEXT STEP: Fix connection pool (5 phut), chay lai smoke test va load test 300 VU de xac nhan cai thien.</w:t>
+                                                  <w:t>[OK] NEXT STEP: Fix connection pool (5 phút), chạy lại smoke test và load test 300 VU để xác nhận cải thiện.</w:t>
                                                 </w:r>
                                               </w:p>
                                               <w:p>
@@ -8140,7 +8140,7 @@
                                                     <w:rFonts w:ascii="Calibri" w:hAnsi="Calibri" w:cs="Calibri"/>
                                                     <w:b/>
                                                   </w:rPr>
-                                                  <w:t>Hien Tai (100</w:t>
+                                                  <w:t>Hiện Tại (100</w:t>
                                                 </w:r>
                                                 <w:r>
                                                   <w:rPr>
@@ -8170,7 +8170,7 @@
                                                     <w:b/>
                                                   </w:rPr>
                                                   <w:lastRenderedPageBreak/>
-                                                  <w:t>Ky Vong Sau Fi</w:t>
+                                                  <w:t>Kỳ Vọng Sau Fi</w:t>
                                                 </w:r>
                                                 <w:r>
                                                   <w:rPr>
@@ -8178,7 +8178,7 @@
                                                     <w:b/>
                                                   </w:rPr>
                                                   <w:lastRenderedPageBreak/>
-                                                  <w:t>x (400 VU on dinh)</w:t>
+                                                  <w:t>x (400 VU ổn định)</w:t>
                                                 </w:r>
                                               </w:p>
                                             </w:tc>
@@ -8238,7 +8238,7 @@
                                                   <w:rPr>
                                                     <w:rFonts w:ascii="Calibri" w:hAnsi="Calibri" w:cs="Calibri"/>
                                                   </w:rPr>
-                                                  <w:t>duoi 2,000ms</w:t>
+                                                  <w:t>dưới 2,000ms</w:t>
                                                 </w:r>
                                               </w:p>
                                             </w:tc>
@@ -8297,7 +8297,7 @@
                                                   <w:rPr>
                                                     <w:rFonts w:ascii="Calibri" w:hAnsi="Calibri" w:cs="Calibri"/>
                                                   </w:rPr>
-                                                  <w:t>duoi 1,500ms</w:t>
+                                                  <w:t>dưới 1,500ms</w:t>
                                                 </w:r>
                                               </w:p>
                                             </w:tc>
@@ -8372,7 +8372,7 @@
                                                     <w:rFonts w:ascii="Calibri" w:hAnsi="Calibri" w:cs="Calibri"/>
                                                   </w:rPr>
                                                   <w:lastRenderedPageBreak/>
-                                                  <w:t>duoi 3,</w:t>
+                                                  <w:t>dưới 3,</w:t>
                                                 </w:r>
                                                 <w:r>
                                                   <w:rPr>
@@ -8439,7 +8439,7 @@
                                                   <w:rPr>
                                                     <w:rFonts w:ascii="Calibri" w:hAnsi="Calibri" w:cs="Calibri"/>
                                                   </w:rPr>
-                                                  <w:t>duoi 3,000ms</w:t>
+                                                  <w:t>dưới 3,000ms</w:t>
                                                 </w:r>
                                               </w:p>
                                             </w:tc>
@@ -8460,7 +8460,7 @@
                                                   <w:rPr>
                                                     <w:rFonts w:ascii="Calibri" w:hAnsi="Calibri" w:cs="Calibri"/>
                                                   </w:rPr>
-                                                  <w:t>Throughput on di</w:t>
+                                                  <w:t>Throughput ổn đị</w:t>
                                                 </w:r>
                                                 <w:r>
                                                   <w:rPr>
@@ -8487,7 +8487,7 @@
                                                     <w:rFonts w:ascii="Calibri" w:hAnsi="Calibri" w:cs="Calibri"/>
                                                   </w:rPr>
                                                   <w:lastRenderedPageBreak/>
-                                                  <w:t>~57 req/s (bi nghe</w:t>
+                                                  <w:t>~57 req/s (bị nghẽ</w:t>
                                                 </w:r>
                                                 <w:r>
                                                   <w:rPr>
@@ -8614,7 +8614,7 @@
                                                   <w:rPr>
                                                     <w:rFonts w:ascii="Calibri" w:hAnsi="Calibri" w:cs="Calibri"/>
                                                   </w:rPr>
-                                                  <w:t>100+ tang lien tuc</w:t>
+                                                  <w:t>100+ tăng liên tục</w:t>
                                                 </w:r>
                                               </w:p>
                                             </w:tc>
@@ -8633,7 +8633,7 @@
                                                   <w:rPr>
                                                     <w:rFonts w:ascii="Calibri" w:hAnsi="Calibri" w:cs="Calibri"/>
                                                   </w:rPr>
-                                                  <w:t>on dinh duoi 50</w:t>
+                                                  <w:t>ổn định dưới 50</w:t>
                                                 </w:r>
                                               </w:p>
                                             </w:tc>
@@ -8670,11 +8670,11 @@
                                         </w:tcPr>
                                         <w:p>
                                           <w:r>
-                                            <w:t>Mot user journey (login-&gt;brow</w:t>
+                                            <w:t>Một user journey (login-&gt;brow</w:t>
                                           </w:r>
                                           <w:r>
                                             <w:lastRenderedPageBreak/>
-                                            <w:t>se-&gt;order) mat 31 giay</w:t>
+                                            <w:t>se-&gt;order) mất 31 giây</w:t>
                                           </w:r>
                                         </w:p>
                                       </w:tc>
@@ -8699,7 +8699,7 @@
                                         </w:tcPr>
                                         <w:p>
                                           <w:r>
-                                            <w:t>1 phut 16 giay</w:t>
+                                            <w:t>1 phút 16 giây</w:t>
                                           </w:r>
                                         </w:p>
                                       </w:tc>
@@ -8710,7 +8710,7 @@
                                         </w:tcPr>
                                         <w:p>
                                           <w:r>
-                                            <w:t>5% user journey mat hon 1 phut 16 giay</w:t>
+                                            <w:t>5% user journey mất hơn 1 phút 16 giây</w:t>
                                           </w:r>
                                         </w:p>
                                       </w:tc>
@@ -8745,7 +8745,7 @@
                                         </w:tcPr>
                                         <w:p>
                                           <w:r>
-                                            <w:t>So user journey hoan thanh trong 13 phut</w:t>
+                                            <w:t>Số user journey hoàn thành trong 13 phút</w:t>
                                           </w:r>
                                         </w:p>
                                       </w:tc>
@@ -8780,7 +8780,7 @@
                                         </w:tcPr>
                                         <w:p>
                                           <w:r>
-                                            <w:t>User dang giua flow khi test ket thuc</w:t>
+                                            <w:t>User đang giữa flow khi test kết thúc</w:t>
                                           </w:r>
                                         </w:p>
                                       </w:tc>
@@ -8815,7 +8815,7 @@
                                         </w:tcPr>
                                         <w:p>
                                           <w:r>
-                                            <w:t>Dinh cao VU dat duoc</w:t>
+                                            <w:t>Đỉnh cao VU đạt được</w:t>
                                           </w:r>
                                         </w:p>
                                       </w:tc>
@@ -8850,7 +8850,7 @@
                                         </w:tcPr>
                                         <w:p>
                                           <w:r>
-                                            <w:t>Tong data nhan tu server</w:t>
+                                            <w:t>Tổng data nhận từ server</w:t>
                                           </w:r>
                                         </w:p>
                                       </w:tc>
@@ -8885,7 +8885,7 @@
                                         </w:tcPr>
                                         <w:p>
                                           <w:r>
-                                            <w:t>Tong data gui len server</w:t>
+                                            <w:t>Tổng data gửi lên server</w:t>
                                           </w:r>
                                         </w:p>
                                       </w:tc>
@@ -8916,11 +8916,11 @@
                                   </w:tcPr>
                                   <w:p>
                                     <w:r>
-                                      <w:t>Trung binh gan 5 giay/request - r</w:t>
+                                      <w:t>Trung bình gần 5 giây/request - rất c</w:t>
                                     </w:r>
                                     <w:r>
                                       <w:lastRenderedPageBreak/>
-                                      <w:t>at cao</w:t>
+                                      <w:t>ao</w:t>
                                     </w:r>
                                   </w:p>
                                 </w:tc>
@@ -8956,7 +8956,7 @@
                                   </w:tcPr>
                                   <w:p>
                                     <w:r>
-                                      <w:t>Request nhanh nhat (health check hoac cache)</w:t>
+                                      <w:t>Request nhanh nhất (health check hoặc cache)</w:t>
                                     </w:r>
                                   </w:p>
                                 </w:tc>
@@ -8991,7 +8991,7 @@
                                   </w:tcPr>
                                   <w:p>
                                     <w:r>
-                                      <w:t>Median duoi 1s - kha tot khi con it VU</w:t>
+                                      <w:t>Median dưới 1s - khá tốt khi còn ít VU</w:t>
                                     </w:r>
                                   </w:p>
                                 </w:tc>
@@ -9026,7 +9026,7 @@
                                   </w:tcPr>
                                   <w:p>
                                     <w:r>
-                                      <w:t>10% request cham nhat mat 16+ giay</w:t>
+                                      <w:t>10% request chậm nhất mất 16+ giây</w:t>
                                     </w:r>
                                   </w:p>
                                 </w:tc>
@@ -9061,7 +9061,7 @@
                                   </w:tcPr>
                                   <w:p>
                                     <w:r>
-                                      <w:t>SLO 3000ms, thuc te gap 7.7 lan</w:t>
+                                      <w:t>SLO 3000ms, thực tế gấp 7.7 lần</w:t>
                                     </w:r>
                                   </w:p>
                                 </w:tc>
@@ -9096,7 +9096,7 @@
                                   </w:tcPr>
                                   <w:p>
                                     <w:r>
-                                      <w:t>Request cham nhat mat 57 giay</w:t>
+                                      <w:t>Request chậm nhất mất 57 giây</w:t>
                                     </w:r>
                                   </w:p>
                                 </w:tc>
@@ -9166,7 +9166,7 @@
                                   </w:tcPr>
                                   <w:p>
                                     <w:r>
-                                      <w:t>Khong co loi - API tiep tuc xu ly du cham</w:t>
+                                      <w:t>Không có lỗi - API tiếp tục xử lý dù chậm</w:t>
                                     </w:r>
                                   </w:p>
                                 </w:tc>
@@ -9197,7 +9197,7 @@
                             </w:tcPr>
                             <w:p>
                               <w:r>
-                                <w:t>Nhanh nhat</w:t>
+                                <w:t>Nhanh nhất</w:t>
                               </w:r>
                             </w:p>
                           </w:tc>
@@ -9233,7 +9233,7 @@
                             </w:tcPr>
                             <w:p>
                               <w:r>
-                                <w:t>MEDIAN 190ms - phan lon order tao nhanh</w:t>
+                                <w:t>MEDIAN 190ms - phần lớn order tạo nhanh</w:t>
                               </w:r>
                             </w:p>
                           </w:tc>
@@ -9268,7 +9268,7 @@
                             </w:tcPr>
                             <w:p>
                               <w:r>
-                                <w:t>Nhay dot ngot tu median</w:t>
+                                <w:t>Nhảy đột ngột từ median</w:t>
                               </w:r>
                             </w:p>
                           </w:tc>
@@ -9303,7 +9303,7 @@
                             </w:tcPr>
                             <w:p>
                               <w:r>
-                                <w:t>SLO la 3000ms, gap 2.6 lan</w:t>
+                                <w:t>SLO là 3000ms, gấp 2.6 lần</w:t>
                               </w:r>
                             </w:p>
                           </w:tc>
@@ -9334,11 +9334,11 @@
                       </w:tcPr>
                       <w:p>
                         <w:r>
-                          <w:t>Trung binh ~4 g</w:t>
+                          <w:t>Trung bình ~4 g</w:t>
                         </w:r>
                         <w:r>
                           <w:lastRenderedPageBreak/>
-                          <w:t>iay cho list products</w:t>
+                          <w:t>iây cho list products</w:t>
                         </w:r>
                       </w:p>
                     </w:tc>
@@ -9374,7 +9374,7 @@
                       </w:tcPr>
                       <w:p>
                         <w:r>
-                          <w:t>Co the la cache hit hoac test khi con it VU</w:t>
+                          <w:t>Có thể là cache hit hoặc test khi còn ít VU</w:t>
                         </w:r>
                       </w:p>
                     </w:tc>
@@ -9409,7 +9409,7 @@
                       </w:tcPr>
                       <w:p>
                         <w:r>
-                          <w:t>Median 1.7s - on khi tai vua</w:t>
+                          <w:t>Median 1.7s - ổn khi tải vừa</w:t>
                         </w:r>
                       </w:p>
                     </w:tc>
@@ -9433,7 +9433,7 @@
                       </w:tcPr>
                       <w:p>
                         <w:r>
-                          <w:t>14,946ms (15 giay)</w:t>
+                          <w:t>14,946ms (15 giây)</w:t>
                         </w:r>
                       </w:p>
                     </w:tc>
@@ -9444,7 +9444,7 @@
                       </w:tcPr>
                       <w:p>
                         <w:r>
-                          <w:t>SLO la 1500ms, thuc te gap 10 lan</w:t>
+                          <w:t>SLO là 1500ms, thực tế gấp 10 lần</w:t>
                         </w:r>
                       </w:p>
                     </w:tc>
@@ -9479,7 +9479,7 @@
                   </w:r>
                   <w:r>
                     <w:lastRenderedPageBreak/>
-                    <w:t>nhanh nhat (it VU, chua co contention)</w:t>
+                    <w:t>nhanh nhất (ít VU, chưa có contention)</w:t>
                   </w:r>
                 </w:p>
               </w:tc>
@@ -9504,7 +9504,7 @@
                 </w:tcPr>
                 <w:p>
                   <w:r>
-                    <w:t>14,003ms (14 giay)</w:t>
+                    <w:t>14,003ms (14 giây)</w:t>
                   </w:r>
                 </w:p>
               </w:tc>
@@ -9515,7 +9515,7 @@
                 </w:tcPr>
                 <w:p>
                   <w:r>
-                    <w:t>Median = 14s: hon 50% user phai cho 14 giay</w:t>
+                    <w:t>Median = 14s: hơn 50% user phải chờ 14 giây</w:t>
                   </w:r>
                 </w:p>
               </w:tc>
@@ -9539,7 +9539,7 @@
                 </w:tcPr>
                 <w:p>
                   <w:r>
-                    <w:t>57,533ms (57.5 giay)</w:t>
+                    <w:t>57,533ms (57.5 giây)</w:t>
                   </w:r>
                 </w:p>
               </w:tc>
@@ -9550,7 +9550,7 @@
                 </w:tcPr>
                 <w:p>
                   <w:r>
-                    <w:t>Mot so user cho gan 1 phut</w:t>
+                    <w:t>Một số user chờ gần 1 phút</w:t>
                   </w:r>
                 </w:p>
               </w:tc>
@@ -9574,7 +9574,7 @@
                 </w:tcPr>
                 <w:p>
                   <w:r>
-                    <w:t>32,373ms (32 giay)</w:t>
+                    <w:t>32,373ms (32 giây)</w:t>
                   </w:r>
                 </w:p>
               </w:tc>
@@ -9585,7 +9585,7 @@
                 </w:tcPr>
                 <w:p>
                   <w:r>
-                    <w:t>10% user cham nhat phai cho 32 giay</w:t>
+                    <w:t>10% user chậm nhất phải chờ 32 giây</w:t>
                   </w:r>
                 </w:p>
               </w:tc>
@@ -9609,7 +9609,7 @@
                 </w:tcPr>
                 <w:p>
                   <w:r>
-                    <w:t>38,998ms (39 giay)</w:t>
+                    <w:t>38,998ms (39 giây)</w:t>
                   </w:r>
                 </w:p>
               </w:tc>
@@ -9620,7 +9620,7 @@
                 </w:tcPr>
                 <w:p>
                   <w:r>
-                    <w:t>SLO la 2000ms, thuc te gap 19.5 lan</w:t>
+                    <w:t>SLO là 2000ms, thực tế gấp 19.5 lần</w:t>
                   </w:r>
                 </w:p>
               </w:tc>
@@ -9698,7 +9698,7 @@
   <w:abstractNum w:abstractNumId="0" w15:restartNumberingAfterBreak="0">
     <w:nsid w:val="FFFFFF89"/>
     <w:multiLevelType w:val="singleLevel"/>
-    <w:tmpl w:val="61C89BFC"/>
+    <w:tmpl w:val="D98431D6"/>
     <w:lvl w:ilvl="0">
       <w:start w:val="1"/>
       <w:numFmt w:val="bullet"/>
@@ -10123,7 +10123,7 @@
     <w:link w:val="Heading1Char"/>
     <w:uiPriority w:val="9"/>
     <w:qFormat/>
-    <w:rsid w:val="000A0407"/>
+    <w:rsid w:val="009E1247"/>
     <w:pPr>
       <w:keepNext/>
       <w:keepLines/>
@@ -10145,7 +10145,7 @@
     <w:uiPriority w:val="9"/>
     <w:unhideWhenUsed/>
     <w:qFormat/>
-    <w:rsid w:val="000A0407"/>
+    <w:rsid w:val="009E1247"/>
     <w:pPr>
       <w:keepNext/>
       <w:keepLines/>
@@ -10167,7 +10167,7 @@
     <w:uiPriority w:val="9"/>
     <w:unhideWhenUsed/>
     <w:qFormat/>
-    <w:rsid w:val="000A0407"/>
+    <w:rsid w:val="009E1247"/>
     <w:pPr>
       <w:keepNext/>
       <w:keepLines/>
@@ -10215,7 +10215,7 @@
     <w:link w:val="TitleChar"/>
     <w:uiPriority w:val="10"/>
     <w:qFormat/>
-    <w:rsid w:val="000A0407"/>
+    <w:rsid w:val="009E1247"/>
     <w:pPr>
       <w:spacing w:after="0" w:line="240" w:lineRule="auto"/>
       <w:contextualSpacing/>
@@ -10233,7 +10233,7 @@
     <w:basedOn w:val="DefaultParagraphFont"/>
     <w:link w:val="Title"/>
     <w:uiPriority w:val="10"/>
-    <w:rsid w:val="000A0407"/>
+    <w:rsid w:val="009E1247"/>
     <w:rPr>
       <w:rFonts w:asciiTheme="majorHAnsi" w:eastAsiaTheme="majorEastAsia" w:hAnsiTheme="majorHAnsi" w:cstheme="majorBidi"/>
       <w:spacing w:val="-10"/>
@@ -10249,7 +10249,7 @@
     <w:link w:val="SubtitleChar"/>
     <w:uiPriority w:val="11"/>
     <w:qFormat/>
-    <w:rsid w:val="000A0407"/>
+    <w:rsid w:val="009E1247"/>
     <w:pPr>
       <w:numPr>
         <w:ilvl w:val="1"/>
@@ -10266,7 +10266,7 @@
     <w:basedOn w:val="DefaultParagraphFont"/>
     <w:link w:val="Subtitle"/>
     <w:uiPriority w:val="11"/>
-    <w:rsid w:val="000A0407"/>
+    <w:rsid w:val="009E1247"/>
     <w:rPr>
       <w:rFonts w:eastAsiaTheme="minorEastAsia"/>
       <w:color w:val="5A5A5A" w:themeColor="text1" w:themeTint="A5"/>
@@ -10278,7 +10278,7 @@
     <w:basedOn w:val="DefaultParagraphFont"/>
     <w:link w:val="Heading1"/>
     <w:uiPriority w:val="9"/>
-    <w:rsid w:val="000A0407"/>
+    <w:rsid w:val="009E1247"/>
     <w:rPr>
       <w:rFonts w:asciiTheme="majorHAnsi" w:eastAsiaTheme="majorEastAsia" w:hAnsiTheme="majorHAnsi" w:cstheme="majorBidi"/>
       <w:color w:val="2E74B5" w:themeColor="accent1" w:themeShade="BF"/>
@@ -10291,7 +10291,7 @@
     <w:basedOn w:val="DefaultParagraphFont"/>
     <w:link w:val="Heading2"/>
     <w:uiPriority w:val="9"/>
-    <w:rsid w:val="000A0407"/>
+    <w:rsid w:val="009E1247"/>
     <w:rPr>
       <w:rFonts w:asciiTheme="majorHAnsi" w:eastAsiaTheme="majorEastAsia" w:hAnsiTheme="majorHAnsi" w:cstheme="majorBidi"/>
       <w:color w:val="2E74B5" w:themeColor="accent1" w:themeShade="BF"/>
@@ -10304,7 +10304,7 @@
     <w:basedOn w:val="DefaultParagraphFont"/>
     <w:link w:val="Heading3"/>
     <w:uiPriority w:val="9"/>
-    <w:rsid w:val="000A0407"/>
+    <w:rsid w:val="009E1247"/>
     <w:rPr>
       <w:rFonts w:asciiTheme="majorHAnsi" w:eastAsiaTheme="majorEastAsia" w:hAnsiTheme="majorHAnsi" w:cstheme="majorBidi"/>
       <w:color w:val="1F4D78" w:themeColor="accent1" w:themeShade="7F"/>
@@ -10317,7 +10317,7 @@
     <w:basedOn w:val="Normal"/>
     <w:uiPriority w:val="99"/>
     <w:unhideWhenUsed/>
-    <w:rsid w:val="000A0407"/>
+    <w:rsid w:val="009E1247"/>
     <w:pPr>
       <w:numPr>
         <w:numId w:val="1"/>
@@ -10329,7 +10329,7 @@
     <w:name w:val="Table Grid"/>
     <w:basedOn w:val="TableNormal"/>
     <w:uiPriority w:val="39"/>
-    <w:rsid w:val="000A0407"/>
+    <w:rsid w:val="009E1247"/>
     <w:pPr>
       <w:spacing w:after="0" w:line="240" w:lineRule="auto"/>
     </w:pPr>

</xml_diff>